<commit_message>
se agrega la parte dos Introduccion,Objetivos de la evaluacion,alcance de infrme,Metodologia de evaluacion
</commit_message>
<xml_diff>
--- a/Carpeta Trabajo/Informe Tecnico.docx
+++ b/Carpeta Trabajo/Informe Tecnico.docx
@@ -4,6 +4,9 @@
   <w:body>
     <w:p>
       <w:r>
+        <w:rPr>
+          <w:noProof/>
+        </w:rPr>
         <w:drawing>
           <wp:anchor distT="0" distB="0" distL="114300" distR="114300" simplePos="0" relativeHeight="251658240" behindDoc="0" locked="0" layoutInCell="1" allowOverlap="1" wp14:anchorId="164D4E6D" wp14:editId="655CD143">
             <wp:simplePos x="0" y="0"/>
@@ -96,8 +99,571 @@
     <w:p/>
     <w:p/>
     <w:p/>
-    <w:p/>
-    <w:p/>
+    <w:p>
+      <w:pPr>
+        <w:jc w:val="both"/>
+        <w:rPr>
+          <w:rFonts w:ascii="Arial" w:hAnsi="Arial" w:cs="Arial"/>
+          <w:b/>
+          <w:bCs/>
+          <w:sz w:val="24"/>
+          <w:szCs w:val="24"/>
+        </w:rPr>
+      </w:pPr>
+      <w:r>
+        <w:rPr>
+          <w:rFonts w:ascii="Arial" w:hAnsi="Arial" w:cs="Arial"/>
+          <w:b/>
+          <w:bCs/>
+          <w:sz w:val="24"/>
+          <w:szCs w:val="24"/>
+        </w:rPr>
+        <w:lastRenderedPageBreak/>
+        <w:t>Introducción</w:t>
+      </w:r>
+    </w:p>
+    <w:p>
+      <w:pPr>
+        <w:jc w:val="both"/>
+        <w:rPr>
+          <w:rFonts w:ascii="Arial" w:hAnsi="Arial" w:cs="Arial"/>
+          <w:sz w:val="24"/>
+          <w:szCs w:val="24"/>
+        </w:rPr>
+      </w:pPr>
+      <w:r>
+        <w:rPr>
+          <w:rFonts w:ascii="Arial" w:hAnsi="Arial" w:cs="Arial"/>
+          <w:sz w:val="24"/>
+          <w:szCs w:val="24"/>
+        </w:rPr>
+        <w:t>Este informe presenta los resultados del proceso de aseguramiento de calidad realizado al módulo de Registro de Usuarios de la aplicación móvil. Se evaluaron diferentes escenarios mediante pruebas funcionales, de rendimiento y de seguridad con el fin de verificar el cumplimiento de los requisitos establecidos en los Casos de Uso del sistema.</w:t>
+      </w:r>
+    </w:p>
+    <w:p>
+      <w:pPr>
+        <w:jc w:val="both"/>
+        <w:rPr>
+          <w:rFonts w:ascii="Arial" w:hAnsi="Arial" w:cs="Arial"/>
+          <w:sz w:val="24"/>
+          <w:szCs w:val="24"/>
+        </w:rPr>
+      </w:pPr>
+    </w:p>
+    <w:p>
+      <w:pPr>
+        <w:jc w:val="both"/>
+        <w:rPr>
+          <w:rFonts w:ascii="Arial" w:hAnsi="Arial" w:cs="Arial"/>
+          <w:b/>
+          <w:bCs/>
+          <w:sz w:val="24"/>
+          <w:szCs w:val="24"/>
+        </w:rPr>
+      </w:pPr>
+      <w:r>
+        <w:rPr>
+          <w:rFonts w:ascii="Arial" w:hAnsi="Arial" w:cs="Arial"/>
+          <w:b/>
+          <w:bCs/>
+          <w:sz w:val="24"/>
+          <w:szCs w:val="24"/>
+        </w:rPr>
+        <w:t>Objetivos de la evaluación</w:t>
+      </w:r>
+    </w:p>
+    <w:p>
+      <w:pPr>
+        <w:jc w:val="both"/>
+        <w:rPr>
+          <w:rFonts w:ascii="Arial" w:hAnsi="Arial" w:cs="Arial"/>
+          <w:sz w:val="24"/>
+          <w:szCs w:val="24"/>
+        </w:rPr>
+      </w:pPr>
+      <w:r>
+        <w:rPr>
+          <w:rFonts w:ascii="Arial" w:hAnsi="Arial" w:cs="Arial"/>
+          <w:sz w:val="24"/>
+          <w:szCs w:val="24"/>
+        </w:rPr>
+        <w:t>Objetivo general</w:t>
+      </w:r>
+    </w:p>
+    <w:p>
+      <w:pPr>
+        <w:jc w:val="both"/>
+        <w:rPr>
+          <w:rFonts w:ascii="Arial" w:hAnsi="Arial" w:cs="Arial"/>
+          <w:sz w:val="24"/>
+          <w:szCs w:val="24"/>
+        </w:rPr>
+      </w:pPr>
+      <w:r>
+        <w:rPr>
+          <w:rFonts w:ascii="Arial" w:hAnsi="Arial" w:cs="Arial"/>
+          <w:sz w:val="24"/>
+          <w:szCs w:val="24"/>
+        </w:rPr>
+        <w:t>Evaluar la calidad del sistema mediante pruebas de software para verificar el cumplimiento de los requisitos funcionales y no funcionales (Usabilidad, Eficiencia y Fiabilidad).</w:t>
+      </w:r>
+    </w:p>
+    <w:p>
+      <w:pPr>
+        <w:jc w:val="both"/>
+        <w:rPr>
+          <w:rFonts w:ascii="Arial" w:hAnsi="Arial" w:cs="Arial"/>
+          <w:sz w:val="24"/>
+          <w:szCs w:val="24"/>
+        </w:rPr>
+      </w:pPr>
+    </w:p>
+    <w:p>
+      <w:pPr>
+        <w:jc w:val="both"/>
+        <w:rPr>
+          <w:rFonts w:ascii="Arial" w:hAnsi="Arial" w:cs="Arial"/>
+          <w:sz w:val="24"/>
+          <w:szCs w:val="24"/>
+        </w:rPr>
+      </w:pPr>
+      <w:r>
+        <w:rPr>
+          <w:rFonts w:ascii="Arial" w:hAnsi="Arial" w:cs="Arial"/>
+          <w:sz w:val="24"/>
+          <w:szCs w:val="24"/>
+        </w:rPr>
+        <w:t>Objetivos específicos</w:t>
+      </w:r>
+    </w:p>
+    <w:p>
+      <w:pPr>
+        <w:jc w:val="both"/>
+        <w:rPr>
+          <w:rFonts w:ascii="Arial" w:hAnsi="Arial" w:cs="Arial"/>
+          <w:sz w:val="24"/>
+          <w:szCs w:val="24"/>
+        </w:rPr>
+      </w:pPr>
+      <w:r>
+        <w:rPr>
+          <w:rFonts w:ascii="Arial" w:hAnsi="Arial" w:cs="Arial"/>
+          <w:sz w:val="24"/>
+          <w:szCs w:val="24"/>
+        </w:rPr>
+        <w:t>Verificar el correcto funcionamiento de las interfaces (</w:t>
+      </w:r>
+      <w:proofErr w:type="spellStart"/>
+      <w:r>
+        <w:rPr>
+          <w:rFonts w:ascii="Arial" w:hAnsi="Arial" w:cs="Arial"/>
+          <w:sz w:val="24"/>
+          <w:szCs w:val="24"/>
+        </w:rPr>
+        <w:t>Frontend</w:t>
+      </w:r>
+      <w:proofErr w:type="spellEnd"/>
+      <w:r>
+        <w:rPr>
+          <w:rFonts w:ascii="Arial" w:hAnsi="Arial" w:cs="Arial"/>
+          <w:sz w:val="24"/>
+          <w:szCs w:val="24"/>
+        </w:rPr>
+        <w:t>) y servicios (Backend).</w:t>
+      </w:r>
+    </w:p>
+    <w:p>
+      <w:pPr>
+        <w:jc w:val="both"/>
+        <w:rPr>
+          <w:rFonts w:ascii="Arial" w:hAnsi="Arial" w:cs="Arial"/>
+          <w:sz w:val="24"/>
+          <w:szCs w:val="24"/>
+        </w:rPr>
+      </w:pPr>
+      <w:r>
+        <w:rPr>
+          <w:rFonts w:ascii="Arial" w:hAnsi="Arial" w:cs="Arial"/>
+          <w:sz w:val="24"/>
+          <w:szCs w:val="24"/>
+        </w:rPr>
+        <w:t>Detectar errores o fallas en el registro de usuarios y la generación de tokens de sesión.</w:t>
+      </w:r>
+    </w:p>
+    <w:p>
+      <w:pPr>
+        <w:jc w:val="both"/>
+        <w:rPr>
+          <w:rFonts w:ascii="Arial" w:hAnsi="Arial" w:cs="Arial"/>
+          <w:sz w:val="24"/>
+          <w:szCs w:val="24"/>
+        </w:rPr>
+      </w:pPr>
+      <w:r>
+        <w:rPr>
+          <w:rFonts w:ascii="Arial" w:hAnsi="Arial" w:cs="Arial"/>
+          <w:sz w:val="24"/>
+          <w:szCs w:val="24"/>
+        </w:rPr>
+        <w:t>Analizar el desempeño y la estabilidad del sistema frente a errores de usuario (correos duplicados).</w:t>
+      </w:r>
+    </w:p>
+    <w:p>
+      <w:pPr>
+        <w:jc w:val="both"/>
+        <w:rPr>
+          <w:rFonts w:ascii="Arial" w:hAnsi="Arial" w:cs="Arial"/>
+          <w:sz w:val="24"/>
+          <w:szCs w:val="24"/>
+        </w:rPr>
+      </w:pPr>
+    </w:p>
+    <w:p>
+      <w:pPr>
+        <w:jc w:val="both"/>
+        <w:rPr>
+          <w:rFonts w:ascii="Arial" w:hAnsi="Arial" w:cs="Arial"/>
+          <w:b/>
+          <w:bCs/>
+          <w:sz w:val="24"/>
+          <w:szCs w:val="24"/>
+        </w:rPr>
+      </w:pPr>
+      <w:r>
+        <w:rPr>
+          <w:rFonts w:ascii="Arial" w:hAnsi="Arial" w:cs="Arial"/>
+          <w:b/>
+          <w:bCs/>
+          <w:sz w:val="24"/>
+          <w:szCs w:val="24"/>
+        </w:rPr>
+        <w:t>Alcance del informe</w:t>
+      </w:r>
+    </w:p>
+    <w:p>
+      <w:pPr>
+        <w:jc w:val="both"/>
+        <w:rPr>
+          <w:rFonts w:ascii="Arial" w:hAnsi="Arial" w:cs="Arial"/>
+          <w:sz w:val="24"/>
+          <w:szCs w:val="24"/>
+        </w:rPr>
+      </w:pPr>
+      <w:r>
+        <w:rPr>
+          <w:rFonts w:ascii="Arial" w:hAnsi="Arial" w:cs="Arial"/>
+          <w:sz w:val="24"/>
+          <w:szCs w:val="24"/>
+        </w:rPr>
+        <w:t>El proceso de evaluación incluyó los siguientes módulos:</w:t>
+      </w:r>
+    </w:p>
+    <w:p>
+      <w:pPr>
+        <w:jc w:val="both"/>
+        <w:rPr>
+          <w:rFonts w:ascii="Arial" w:hAnsi="Arial" w:cs="Arial"/>
+          <w:sz w:val="24"/>
+          <w:szCs w:val="24"/>
+        </w:rPr>
+      </w:pPr>
+      <w:r>
+        <w:rPr>
+          <w:rFonts w:ascii="Arial" w:hAnsi="Arial" w:cs="Arial"/>
+          <w:sz w:val="24"/>
+          <w:szCs w:val="24"/>
+        </w:rPr>
+        <w:t>C.U 1: Solicitud de Registro de cuenta (</w:t>
+      </w:r>
+      <w:proofErr w:type="spellStart"/>
+      <w:r>
+        <w:rPr>
+          <w:rFonts w:ascii="Arial" w:hAnsi="Arial" w:cs="Arial"/>
+          <w:sz w:val="24"/>
+          <w:szCs w:val="24"/>
+        </w:rPr>
+        <w:t>Frontend</w:t>
+      </w:r>
+      <w:proofErr w:type="spellEnd"/>
+      <w:r>
+        <w:rPr>
+          <w:rFonts w:ascii="Arial" w:hAnsi="Arial" w:cs="Arial"/>
+          <w:sz w:val="24"/>
+          <w:szCs w:val="24"/>
+        </w:rPr>
+        <w:t>).</w:t>
+      </w:r>
+    </w:p>
+    <w:p>
+      <w:pPr>
+        <w:jc w:val="both"/>
+        <w:rPr>
+          <w:rFonts w:ascii="Arial" w:hAnsi="Arial" w:cs="Arial"/>
+          <w:sz w:val="24"/>
+          <w:szCs w:val="24"/>
+        </w:rPr>
+      </w:pPr>
+      <w:r>
+        <w:rPr>
+          <w:rFonts w:ascii="Arial" w:hAnsi="Arial" w:cs="Arial"/>
+          <w:sz w:val="24"/>
+          <w:szCs w:val="24"/>
+        </w:rPr>
+        <w:t>C.U 2: Persistencia de Nuevo Usuario (Backend / Base de datos).</w:t>
+      </w:r>
+    </w:p>
+    <w:p>
+      <w:pPr>
+        <w:jc w:val="both"/>
+        <w:rPr>
+          <w:rFonts w:ascii="Arial" w:hAnsi="Arial" w:cs="Arial"/>
+          <w:sz w:val="24"/>
+          <w:szCs w:val="24"/>
+        </w:rPr>
+      </w:pPr>
+      <w:r>
+        <w:rPr>
+          <w:rFonts w:ascii="Arial" w:hAnsi="Arial" w:cs="Arial"/>
+          <w:sz w:val="24"/>
+          <w:szCs w:val="24"/>
+        </w:rPr>
+        <w:t>C.U 3: Gestión de Error por Duplicidad.</w:t>
+      </w:r>
+    </w:p>
+    <w:p>
+      <w:pPr>
+        <w:jc w:val="both"/>
+        <w:rPr>
+          <w:rFonts w:ascii="Arial" w:hAnsi="Arial" w:cs="Arial"/>
+          <w:sz w:val="24"/>
+          <w:szCs w:val="24"/>
+        </w:rPr>
+      </w:pPr>
+      <w:r>
+        <w:rPr>
+          <w:rFonts w:ascii="Arial" w:hAnsi="Arial" w:cs="Arial"/>
+          <w:sz w:val="24"/>
+          <w:szCs w:val="24"/>
+        </w:rPr>
+        <w:t>No se evaluaron otros módulos como recuperación de contraseñas ni el inicio de sesión.</w:t>
+      </w:r>
+    </w:p>
+    <w:p>
+      <w:pPr>
+        <w:jc w:val="both"/>
+        <w:rPr>
+          <w:rFonts w:ascii="Arial" w:hAnsi="Arial" w:cs="Arial"/>
+          <w:sz w:val="24"/>
+          <w:szCs w:val="24"/>
+        </w:rPr>
+      </w:pPr>
+    </w:p>
+    <w:p>
+      <w:pPr>
+        <w:jc w:val="both"/>
+        <w:rPr>
+          <w:rFonts w:ascii="Arial" w:hAnsi="Arial" w:cs="Arial"/>
+          <w:sz w:val="24"/>
+          <w:szCs w:val="24"/>
+        </w:rPr>
+      </w:pPr>
+    </w:p>
+    <w:p>
+      <w:pPr>
+        <w:jc w:val="both"/>
+        <w:rPr>
+          <w:rFonts w:ascii="Arial" w:hAnsi="Arial" w:cs="Arial"/>
+          <w:sz w:val="24"/>
+          <w:szCs w:val="24"/>
+        </w:rPr>
+      </w:pPr>
+    </w:p>
+    <w:p>
+      <w:pPr>
+        <w:jc w:val="both"/>
+        <w:rPr>
+          <w:rFonts w:ascii="Arial" w:hAnsi="Arial" w:cs="Arial"/>
+          <w:sz w:val="24"/>
+          <w:szCs w:val="24"/>
+        </w:rPr>
+      </w:pPr>
+    </w:p>
+    <w:p>
+      <w:pPr>
+        <w:jc w:val="both"/>
+        <w:rPr>
+          <w:rFonts w:ascii="Arial" w:hAnsi="Arial" w:cs="Arial"/>
+          <w:sz w:val="24"/>
+          <w:szCs w:val="24"/>
+        </w:rPr>
+      </w:pPr>
+    </w:p>
+    <w:p>
+      <w:pPr>
+        <w:jc w:val="both"/>
+        <w:rPr>
+          <w:rFonts w:ascii="Arial" w:hAnsi="Arial" w:cs="Arial"/>
+          <w:b/>
+          <w:bCs/>
+          <w:sz w:val="24"/>
+          <w:szCs w:val="24"/>
+        </w:rPr>
+      </w:pPr>
+      <w:r>
+        <w:rPr>
+          <w:rFonts w:ascii="Arial" w:hAnsi="Arial" w:cs="Arial"/>
+          <w:b/>
+          <w:bCs/>
+          <w:sz w:val="24"/>
+          <w:szCs w:val="24"/>
+        </w:rPr>
+        <w:t>Metodología de evaluación</w:t>
+      </w:r>
+    </w:p>
+    <w:p>
+      <w:pPr>
+        <w:jc w:val="both"/>
+        <w:rPr>
+          <w:rFonts w:ascii="Arial" w:hAnsi="Arial" w:cs="Arial"/>
+          <w:sz w:val="24"/>
+          <w:szCs w:val="24"/>
+        </w:rPr>
+      </w:pPr>
+      <w:r>
+        <w:rPr>
+          <w:rFonts w:ascii="Arial" w:hAnsi="Arial" w:cs="Arial"/>
+          <w:sz w:val="24"/>
+          <w:szCs w:val="24"/>
+        </w:rPr>
+        <w:t>Se aplicaron las siguientes pruebas:</w:t>
+      </w:r>
+    </w:p>
+    <w:p>
+      <w:pPr>
+        <w:jc w:val="both"/>
+        <w:rPr>
+          <w:rFonts w:ascii="Arial" w:hAnsi="Arial" w:cs="Arial"/>
+          <w:sz w:val="24"/>
+          <w:szCs w:val="24"/>
+        </w:rPr>
+      </w:pPr>
+      <w:r>
+        <w:rPr>
+          <w:rFonts w:ascii="Arial" w:hAnsi="Arial" w:cs="Arial"/>
+          <w:sz w:val="24"/>
+          <w:szCs w:val="24"/>
+        </w:rPr>
+        <w:t>Pruebas funcionales</w:t>
+      </w:r>
+    </w:p>
+    <w:p>
+      <w:pPr>
+        <w:jc w:val="both"/>
+        <w:rPr>
+          <w:rFonts w:ascii="Arial" w:hAnsi="Arial" w:cs="Arial"/>
+          <w:sz w:val="24"/>
+          <w:szCs w:val="24"/>
+        </w:rPr>
+      </w:pPr>
+      <w:r>
+        <w:rPr>
+          <w:rFonts w:ascii="Arial" w:hAnsi="Arial" w:cs="Arial"/>
+          <w:sz w:val="24"/>
+          <w:szCs w:val="24"/>
+        </w:rPr>
+        <w:t>Pruebas de rendimiento</w:t>
+      </w:r>
+    </w:p>
+    <w:p>
+      <w:pPr>
+        <w:jc w:val="both"/>
+        <w:rPr>
+          <w:rFonts w:ascii="Arial" w:hAnsi="Arial" w:cs="Arial"/>
+          <w:sz w:val="24"/>
+          <w:szCs w:val="24"/>
+        </w:rPr>
+      </w:pPr>
+      <w:r>
+        <w:rPr>
+          <w:rFonts w:ascii="Arial" w:hAnsi="Arial" w:cs="Arial"/>
+          <w:sz w:val="24"/>
+          <w:szCs w:val="24"/>
+        </w:rPr>
+        <w:t>Pruebas de manejo de excepciones</w:t>
+      </w:r>
+    </w:p>
+    <w:p>
+      <w:pPr>
+        <w:jc w:val="both"/>
+        <w:rPr>
+          <w:rFonts w:ascii="Arial" w:hAnsi="Arial" w:cs="Arial"/>
+          <w:sz w:val="24"/>
+          <w:szCs w:val="24"/>
+        </w:rPr>
+      </w:pPr>
+      <w:r>
+        <w:rPr>
+          <w:rFonts w:ascii="Arial" w:hAnsi="Arial" w:cs="Arial"/>
+          <w:sz w:val="24"/>
+          <w:szCs w:val="24"/>
+        </w:rPr>
+        <w:t>Herramientas utilizadas:</w:t>
+      </w:r>
+    </w:p>
+    <w:p>
+      <w:pPr>
+        <w:jc w:val="both"/>
+        <w:rPr>
+          <w:rFonts w:ascii="Arial" w:hAnsi="Arial" w:cs="Arial"/>
+          <w:sz w:val="24"/>
+          <w:szCs w:val="24"/>
+        </w:rPr>
+      </w:pPr>
+      <w:r>
+        <w:rPr>
+          <w:rFonts w:ascii="Arial" w:hAnsi="Arial" w:cs="Arial"/>
+          <w:sz w:val="24"/>
+          <w:szCs w:val="24"/>
+        </w:rPr>
+        <w:t>Postman (Para pruebas de API y respuesta del servidor).</w:t>
+      </w:r>
+    </w:p>
+    <w:p>
+      <w:pPr>
+        <w:jc w:val="both"/>
+        <w:rPr>
+          <w:rFonts w:ascii="Arial" w:hAnsi="Arial" w:cs="Arial"/>
+          <w:sz w:val="24"/>
+          <w:szCs w:val="24"/>
+        </w:rPr>
+      </w:pPr>
+      <w:r>
+        <w:rPr>
+          <w:rFonts w:ascii="Arial" w:hAnsi="Arial" w:cs="Arial"/>
+          <w:sz w:val="24"/>
+          <w:szCs w:val="24"/>
+        </w:rPr>
+        <w:t xml:space="preserve">Emulador de </w:t>
+      </w:r>
+      <w:proofErr w:type="spellStart"/>
+      <w:r>
+        <w:rPr>
+          <w:rFonts w:ascii="Arial" w:hAnsi="Arial" w:cs="Arial"/>
+          <w:sz w:val="24"/>
+          <w:szCs w:val="24"/>
+        </w:rPr>
+        <w:t>Appium</w:t>
+      </w:r>
+      <w:proofErr w:type="spellEnd"/>
+      <w:r>
+        <w:rPr>
+          <w:rFonts w:ascii="Arial" w:hAnsi="Arial" w:cs="Arial"/>
+          <w:sz w:val="24"/>
+          <w:szCs w:val="24"/>
+        </w:rPr>
+        <w:t xml:space="preserve"> (Para simular la interacción en el dispositivo móvil).</w:t>
+      </w:r>
+    </w:p>
     <w:sectPr>
       <w:pgSz w:w="12240" w:h="15840"/>
       <w:pgMar w:top="1417" w:right="1701" w:bottom="1417" w:left="1701" w:header="708" w:footer="708" w:gutter="0"/>
@@ -717,6 +1283,7 @@
   <w:style w:type="character" w:default="1" w:styleId="Fuentedeprrafopredeter">
     <w:name w:val="Default Paragraph Font"/>
     <w:uiPriority w:val="1"/>
+    <w:semiHidden/>
     <w:unhideWhenUsed/>
   </w:style>
   <w:style w:type="table" w:default="1" w:styleId="Tablanormal">

</xml_diff>

<commit_message>
Comit 6 se agregan los Analisis de Resiltados
</commit_message>
<xml_diff>
--- a/Carpeta Trabajo/Informe Tecnico.docx
+++ b/Carpeta Trabajo/Informe Tecnico.docx
@@ -33,7 +33,7 @@
                     </pic:cNvPicPr>
                   </pic:nvPicPr>
                   <pic:blipFill>
-                    <a:blip r:embed="rId4">
+                    <a:blip r:embed="rId5">
                       <a:extLst>
                         <a:ext uri="{28A0092B-C50C-407E-A947-70E740481C1C}">
                           <a14:useLocalDpi xmlns:a14="http://schemas.microsoft.com/office/drawing/2010/main" val="0"/>
@@ -70,6 +70,11 @@
           </wp:anchor>
         </w:drawing>
       </w:r>
+      <w:proofErr w:type="spellStart"/>
+      <w:r>
+        <w:t>rx</w:t>
+      </w:r>
+      <w:proofErr w:type="spellEnd"/>
     </w:p>
     <w:p/>
     <w:p/>
@@ -664,6 +669,1877 @@
         <w:t xml:space="preserve"> (Para simular la interacción en el dispositivo móvil).</w:t>
       </w:r>
     </w:p>
+    <w:p>
+      <w:pPr>
+        <w:ind w:firstLine="708"/>
+        <w:rPr>
+          <w:b/>
+          <w:bCs/>
+        </w:rPr>
+      </w:pPr>
+      <w:r>
+        <w:rPr>
+          <w:b/>
+          <w:bCs/>
+        </w:rPr>
+        <w:t>Reporte de Pruebas: Proyecto UTTT-MOBILE</w:t>
+      </w:r>
+    </w:p>
+    <w:p>
+      <w:pPr>
+        <w:rPr>
+          <w:b/>
+          <w:bCs/>
+        </w:rPr>
+      </w:pPr>
+      <w:r>
+        <w:rPr>
+          <w:b/>
+          <w:bCs/>
+        </w:rPr>
+        <w:t>Casos de Prueba (Resumen)</w:t>
+      </w:r>
+      <w:r>
+        <w:rPr>
+          <w:b/>
+          <w:bCs/>
+        </w:rPr>
+        <w:t xml:space="preserve"> HERRAMIENTA Junit</w:t>
+      </w:r>
+    </w:p>
+    <w:p>
+      <w:r>
+        <w:t>Usamos el formato solicitado para validar los puntos clave:</w:t>
+      </w:r>
+    </w:p>
+    <w:tbl>
+      <w:tblPr>
+        <w:tblStyle w:val="Tabladelista3-nfasis6"/>
+        <w:tblW w:w="0" w:type="auto"/>
+        <w:tblLook w:val="04A0" w:firstRow="1" w:lastRow="0" w:firstColumn="1" w:lastColumn="0" w:noHBand="0" w:noVBand="1"/>
+      </w:tblPr>
+      <w:tblGrid>
+        <w:gridCol w:w="460"/>
+        <w:gridCol w:w="1870"/>
+        <w:gridCol w:w="2509"/>
+        <w:gridCol w:w="3084"/>
+        <w:gridCol w:w="905"/>
+      </w:tblGrid>
+      <w:tr>
+        <w:trPr>
+          <w:cnfStyle w:val="100000000000" w:firstRow="1" w:lastRow="0" w:firstColumn="0" w:lastColumn="0" w:oddVBand="0" w:evenVBand="0" w:oddHBand="0" w:evenHBand="0" w:firstRowFirstColumn="0" w:firstRowLastColumn="0" w:lastRowFirstColumn="0" w:lastRowLastColumn="0"/>
+        </w:trPr>
+        <w:tc>
+          <w:tcPr>
+            <w:cnfStyle w:val="001000000100" w:firstRow="0" w:lastRow="0" w:firstColumn="1" w:lastColumn="0" w:oddVBand="0" w:evenVBand="0" w:oddHBand="0" w:evenHBand="0" w:firstRowFirstColumn="1" w:firstRowLastColumn="0" w:lastRowFirstColumn="0" w:lastRowLastColumn="0"/>
+            <w:tcW w:w="0" w:type="auto"/>
+            <w:hideMark/>
+          </w:tcPr>
+          <w:p>
+            <w:pPr>
+              <w:spacing w:after="160" w:line="278" w:lineRule="auto"/>
+            </w:pPr>
+            <w:r>
+              <w:t>ID</w:t>
+            </w:r>
+          </w:p>
+        </w:tc>
+        <w:tc>
+          <w:tcPr>
+            <w:tcW w:w="0" w:type="auto"/>
+            <w:hideMark/>
+          </w:tcPr>
+          <w:p>
+            <w:pPr>
+              <w:spacing w:after="160" w:line="278" w:lineRule="auto"/>
+              <w:cnfStyle w:val="100000000000" w:firstRow="1" w:lastRow="0" w:firstColumn="0" w:lastColumn="0" w:oddVBand="0" w:evenVBand="0" w:oddHBand="0" w:evenHBand="0" w:firstRowFirstColumn="0" w:firstRowLastColumn="0" w:lastRowFirstColumn="0" w:lastRowLastColumn="0"/>
+            </w:pPr>
+            <w:r>
+              <w:t>Lo que probamos</w:t>
+            </w:r>
+          </w:p>
+        </w:tc>
+        <w:tc>
+          <w:tcPr>
+            <w:tcW w:w="0" w:type="auto"/>
+            <w:hideMark/>
+          </w:tcPr>
+          <w:p>
+            <w:pPr>
+              <w:spacing w:after="160" w:line="278" w:lineRule="auto"/>
+              <w:cnfStyle w:val="100000000000" w:firstRow="1" w:lastRow="0" w:firstColumn="0" w:lastColumn="0" w:oddVBand="0" w:evenVBand="0" w:oddHBand="0" w:evenHBand="0" w:firstRowFirstColumn="0" w:firstRowLastColumn="0" w:lastRowFirstColumn="0" w:lastRowLastColumn="0"/>
+            </w:pPr>
+            <w:r>
+              <w:t>¿Qué ingresamos?</w:t>
+            </w:r>
+          </w:p>
+        </w:tc>
+        <w:tc>
+          <w:tcPr>
+            <w:tcW w:w="0" w:type="auto"/>
+            <w:hideMark/>
+          </w:tcPr>
+          <w:p>
+            <w:pPr>
+              <w:spacing w:after="160" w:line="278" w:lineRule="auto"/>
+              <w:cnfStyle w:val="100000000000" w:firstRow="1" w:lastRow="0" w:firstColumn="0" w:lastColumn="0" w:oddVBand="0" w:evenVBand="0" w:oddHBand="0" w:evenHBand="0" w:firstRowFirstColumn="0" w:firstRowLastColumn="0" w:lastRowFirstColumn="0" w:lastRowLastColumn="0"/>
+            </w:pPr>
+            <w:r>
+              <w:t>Resultado esperado</w:t>
+            </w:r>
+          </w:p>
+        </w:tc>
+        <w:tc>
+          <w:tcPr>
+            <w:tcW w:w="0" w:type="auto"/>
+            <w:hideMark/>
+          </w:tcPr>
+          <w:p>
+            <w:pPr>
+              <w:spacing w:after="160" w:line="278" w:lineRule="auto"/>
+              <w:cnfStyle w:val="100000000000" w:firstRow="1" w:lastRow="0" w:firstColumn="0" w:lastColumn="0" w:oddVBand="0" w:evenVBand="0" w:oddHBand="0" w:evenHBand="0" w:firstRowFirstColumn="0" w:firstRowLastColumn="0" w:lastRowFirstColumn="0" w:lastRowLastColumn="0"/>
+            </w:pPr>
+            <w:r>
+              <w:t>¿Pasó?</w:t>
+            </w:r>
+          </w:p>
+        </w:tc>
+      </w:tr>
+      <w:tr>
+        <w:trPr>
+          <w:cnfStyle w:val="000000100000" w:firstRow="0" w:lastRow="0" w:firstColumn="0" w:lastColumn="0" w:oddVBand="0" w:evenVBand="0" w:oddHBand="1" w:evenHBand="0" w:firstRowFirstColumn="0" w:firstRowLastColumn="0" w:lastRowFirstColumn="0" w:lastRowLastColumn="0"/>
+        </w:trPr>
+        <w:tc>
+          <w:tcPr>
+            <w:cnfStyle w:val="001000000000" w:firstRow="0" w:lastRow="0" w:firstColumn="1" w:lastColumn="0" w:oddVBand="0" w:evenVBand="0" w:oddHBand="0" w:evenHBand="0" w:firstRowFirstColumn="0" w:firstRowLastColumn="0" w:lastRowFirstColumn="0" w:lastRowLastColumn="0"/>
+            <w:tcW w:w="0" w:type="auto"/>
+            <w:hideMark/>
+          </w:tcPr>
+          <w:p>
+            <w:pPr>
+              <w:spacing w:after="160" w:line="278" w:lineRule="auto"/>
+            </w:pPr>
+            <w:r>
+              <w:t>01</w:t>
+            </w:r>
+          </w:p>
+        </w:tc>
+        <w:tc>
+          <w:tcPr>
+            <w:tcW w:w="0" w:type="auto"/>
+            <w:hideMark/>
+          </w:tcPr>
+          <w:p>
+            <w:pPr>
+              <w:spacing w:after="160" w:line="278" w:lineRule="auto"/>
+              <w:cnfStyle w:val="000000100000" w:firstRow="0" w:lastRow="0" w:firstColumn="0" w:lastColumn="0" w:oddVBand="0" w:evenVBand="0" w:oddHBand="1" w:evenHBand="0" w:firstRowFirstColumn="0" w:firstRowLastColumn="0" w:lastRowFirstColumn="0" w:lastRowLastColumn="0"/>
+            </w:pPr>
+            <w:r>
+              <w:t>Registro nuevo</w:t>
+            </w:r>
+          </w:p>
+        </w:tc>
+        <w:tc>
+          <w:tcPr>
+            <w:tcW w:w="0" w:type="auto"/>
+            <w:hideMark/>
+          </w:tcPr>
+          <w:p>
+            <w:pPr>
+              <w:spacing w:after="160" w:line="278" w:lineRule="auto"/>
+              <w:cnfStyle w:val="000000100000" w:firstRow="0" w:lastRow="0" w:firstColumn="0" w:lastColumn="0" w:oddVBand="0" w:evenVBand="0" w:oddHBand="1" w:evenHBand="0" w:firstRowFirstColumn="0" w:firstRowLastColumn="0" w:lastRowFirstColumn="0" w:lastRowLastColumn="0"/>
+            </w:pPr>
+            <w:r>
+              <w:t>Matrícula y correo</w:t>
+            </w:r>
+          </w:p>
+        </w:tc>
+        <w:tc>
+          <w:tcPr>
+            <w:tcW w:w="0" w:type="auto"/>
+            <w:hideMark/>
+          </w:tcPr>
+          <w:p>
+            <w:pPr>
+              <w:spacing w:after="160" w:line="278" w:lineRule="auto"/>
+              <w:cnfStyle w:val="000000100000" w:firstRow="0" w:lastRow="0" w:firstColumn="0" w:lastColumn="0" w:oddVBand="0" w:evenVBand="0" w:oddHBand="1" w:evenHBand="0" w:firstRowFirstColumn="0" w:firstRowLastColumn="0" w:lastRowFirstColumn="0" w:lastRowLastColumn="0"/>
+            </w:pPr>
+            <w:r>
+              <w:t>Crea el usuario correctamente</w:t>
+            </w:r>
+          </w:p>
+        </w:tc>
+        <w:tc>
+          <w:tcPr>
+            <w:tcW w:w="0" w:type="auto"/>
+            <w:hideMark/>
+          </w:tcPr>
+          <w:p>
+            <w:pPr>
+              <w:spacing w:after="160" w:line="278" w:lineRule="auto"/>
+              <w:cnfStyle w:val="000000100000" w:firstRow="0" w:lastRow="0" w:firstColumn="0" w:lastColumn="0" w:oddVBand="0" w:evenVBand="0" w:oddHBand="1" w:evenHBand="0" w:firstRowFirstColumn="0" w:firstRowLastColumn="0" w:lastRowFirstColumn="0" w:lastRowLastColumn="0"/>
+            </w:pPr>
+            <w:r>
+              <w:rPr>
+                <w:rFonts w:ascii="Segoe UI Emoji" w:hAnsi="Segoe UI Emoji" w:cs="Segoe UI Emoji"/>
+              </w:rPr>
+              <w:t>✅</w:t>
+            </w:r>
+          </w:p>
+        </w:tc>
+      </w:tr>
+      <w:tr>
+        <w:tc>
+          <w:tcPr>
+            <w:cnfStyle w:val="001000000000" w:firstRow="0" w:lastRow="0" w:firstColumn="1" w:lastColumn="0" w:oddVBand="0" w:evenVBand="0" w:oddHBand="0" w:evenHBand="0" w:firstRowFirstColumn="0" w:firstRowLastColumn="0" w:lastRowFirstColumn="0" w:lastRowLastColumn="0"/>
+            <w:tcW w:w="0" w:type="auto"/>
+            <w:hideMark/>
+          </w:tcPr>
+          <w:p>
+            <w:pPr>
+              <w:spacing w:after="160" w:line="278" w:lineRule="auto"/>
+            </w:pPr>
+            <w:r>
+              <w:t>02</w:t>
+            </w:r>
+          </w:p>
+        </w:tc>
+        <w:tc>
+          <w:tcPr>
+            <w:tcW w:w="0" w:type="auto"/>
+            <w:hideMark/>
+          </w:tcPr>
+          <w:p>
+            <w:pPr>
+              <w:spacing w:after="160" w:line="278" w:lineRule="auto"/>
+              <w:cnfStyle w:val="000000000000" w:firstRow="0" w:lastRow="0" w:firstColumn="0" w:lastColumn="0" w:oddVBand="0" w:evenVBand="0" w:oddHBand="0" w:evenHBand="0" w:firstRowFirstColumn="0" w:firstRowLastColumn="0" w:lastRowFirstColumn="0" w:lastRowLastColumn="0"/>
+            </w:pPr>
+            <w:r>
+              <w:t>Login con error</w:t>
+            </w:r>
+          </w:p>
+        </w:tc>
+        <w:tc>
+          <w:tcPr>
+            <w:tcW w:w="0" w:type="auto"/>
+            <w:hideMark/>
+          </w:tcPr>
+          <w:p>
+            <w:pPr>
+              <w:spacing w:after="160" w:line="278" w:lineRule="auto"/>
+              <w:cnfStyle w:val="000000000000" w:firstRow="0" w:lastRow="0" w:firstColumn="0" w:lastColumn="0" w:oddVBand="0" w:evenVBand="0" w:oddHBand="0" w:evenHBand="0" w:firstRowFirstColumn="0" w:firstRowLastColumn="0" w:lastRowFirstColumn="0" w:lastRowLastColumn="0"/>
+            </w:pPr>
+            <w:proofErr w:type="spellStart"/>
+            <w:r>
+              <w:t>Password</w:t>
+            </w:r>
+            <w:proofErr w:type="spellEnd"/>
+            <w:r>
+              <w:t xml:space="preserve"> incorrecto</w:t>
+            </w:r>
+          </w:p>
+        </w:tc>
+        <w:tc>
+          <w:tcPr>
+            <w:tcW w:w="0" w:type="auto"/>
+            <w:hideMark/>
+          </w:tcPr>
+          <w:p>
+            <w:pPr>
+              <w:spacing w:after="160" w:line="278" w:lineRule="auto"/>
+              <w:cnfStyle w:val="000000000000" w:firstRow="0" w:lastRow="0" w:firstColumn="0" w:lastColumn="0" w:oddVBand="0" w:evenVBand="0" w:oddHBand="0" w:evenHBand="0" w:firstRowFirstColumn="0" w:firstRowLastColumn="0" w:lastRowFirstColumn="0" w:lastRowLastColumn="0"/>
+            </w:pPr>
+            <w:r>
+              <w:t>Muestra alerta de error</w:t>
+            </w:r>
+          </w:p>
+        </w:tc>
+        <w:tc>
+          <w:tcPr>
+            <w:tcW w:w="0" w:type="auto"/>
+            <w:hideMark/>
+          </w:tcPr>
+          <w:p>
+            <w:pPr>
+              <w:spacing w:after="160" w:line="278" w:lineRule="auto"/>
+              <w:cnfStyle w:val="000000000000" w:firstRow="0" w:lastRow="0" w:firstColumn="0" w:lastColumn="0" w:oddVBand="0" w:evenVBand="0" w:oddHBand="0" w:evenHBand="0" w:firstRowFirstColumn="0" w:firstRowLastColumn="0" w:lastRowFirstColumn="0" w:lastRowLastColumn="0"/>
+            </w:pPr>
+            <w:r>
+              <w:rPr>
+                <w:rFonts w:ascii="Segoe UI Emoji" w:hAnsi="Segoe UI Emoji" w:cs="Segoe UI Emoji"/>
+              </w:rPr>
+              <w:t>✅</w:t>
+            </w:r>
+          </w:p>
+        </w:tc>
+      </w:tr>
+      <w:tr>
+        <w:trPr>
+          <w:cnfStyle w:val="000000100000" w:firstRow="0" w:lastRow="0" w:firstColumn="0" w:lastColumn="0" w:oddVBand="0" w:evenVBand="0" w:oddHBand="1" w:evenHBand="0" w:firstRowFirstColumn="0" w:firstRowLastColumn="0" w:lastRowFirstColumn="0" w:lastRowLastColumn="0"/>
+        </w:trPr>
+        <w:tc>
+          <w:tcPr>
+            <w:cnfStyle w:val="001000000000" w:firstRow="0" w:lastRow="0" w:firstColumn="1" w:lastColumn="0" w:oddVBand="0" w:evenVBand="0" w:oddHBand="0" w:evenHBand="0" w:firstRowFirstColumn="0" w:firstRowLastColumn="0" w:lastRowFirstColumn="0" w:lastRowLastColumn="0"/>
+            <w:tcW w:w="0" w:type="auto"/>
+            <w:hideMark/>
+          </w:tcPr>
+          <w:p>
+            <w:pPr>
+              <w:spacing w:after="160" w:line="278" w:lineRule="auto"/>
+            </w:pPr>
+            <w:r>
+              <w:t>03</w:t>
+            </w:r>
+          </w:p>
+        </w:tc>
+        <w:tc>
+          <w:tcPr>
+            <w:tcW w:w="0" w:type="auto"/>
+            <w:hideMark/>
+          </w:tcPr>
+          <w:p>
+            <w:pPr>
+              <w:spacing w:after="160" w:line="278" w:lineRule="auto"/>
+              <w:cnfStyle w:val="000000100000" w:firstRow="0" w:lastRow="0" w:firstColumn="0" w:lastColumn="0" w:oddVBand="0" w:evenVBand="0" w:oddHBand="1" w:evenHBand="0" w:firstRowFirstColumn="0" w:firstRowLastColumn="0" w:lastRowFirstColumn="0" w:lastRowLastColumn="0"/>
+            </w:pPr>
+            <w:r>
+              <w:t>Campos vacíos</w:t>
+            </w:r>
+          </w:p>
+        </w:tc>
+        <w:tc>
+          <w:tcPr>
+            <w:tcW w:w="0" w:type="auto"/>
+            <w:hideMark/>
+          </w:tcPr>
+          <w:p>
+            <w:pPr>
+              <w:spacing w:after="160" w:line="278" w:lineRule="auto"/>
+              <w:cnfStyle w:val="000000100000" w:firstRow="0" w:lastRow="0" w:firstColumn="0" w:lastColumn="0" w:oddVBand="0" w:evenVBand="0" w:oddHBand="1" w:evenHBand="0" w:firstRowFirstColumn="0" w:firstRowLastColumn="0" w:lastRowFirstColumn="0" w:lastRowLastColumn="0"/>
+            </w:pPr>
+            <w:r>
+              <w:t>Clic en "Entrar" sin datos</w:t>
+            </w:r>
+          </w:p>
+        </w:tc>
+        <w:tc>
+          <w:tcPr>
+            <w:tcW w:w="0" w:type="auto"/>
+            <w:hideMark/>
+          </w:tcPr>
+          <w:p>
+            <w:pPr>
+              <w:spacing w:after="160" w:line="278" w:lineRule="auto"/>
+              <w:cnfStyle w:val="000000100000" w:firstRow="0" w:lastRow="0" w:firstColumn="0" w:lastColumn="0" w:oddVBand="0" w:evenVBand="0" w:oddHBand="1" w:evenHBand="0" w:firstRowFirstColumn="0" w:firstRowLastColumn="0" w:lastRowFirstColumn="0" w:lastRowLastColumn="0"/>
+            </w:pPr>
+            <w:r>
+              <w:t>No deja avanzar (bloqueo)</w:t>
+            </w:r>
+          </w:p>
+        </w:tc>
+        <w:tc>
+          <w:tcPr>
+            <w:tcW w:w="0" w:type="auto"/>
+            <w:hideMark/>
+          </w:tcPr>
+          <w:p>
+            <w:pPr>
+              <w:spacing w:after="160" w:line="278" w:lineRule="auto"/>
+              <w:cnfStyle w:val="000000100000" w:firstRow="0" w:lastRow="0" w:firstColumn="0" w:lastColumn="0" w:oddVBand="0" w:evenVBand="0" w:oddHBand="1" w:evenHBand="0" w:firstRowFirstColumn="0" w:firstRowLastColumn="0" w:lastRowFirstColumn="0" w:lastRowLastColumn="0"/>
+            </w:pPr>
+            <w:r>
+              <w:rPr>
+                <w:rFonts w:ascii="Segoe UI Emoji" w:hAnsi="Segoe UI Emoji" w:cs="Segoe UI Emoji"/>
+              </w:rPr>
+              <w:t>✅</w:t>
+            </w:r>
+          </w:p>
+        </w:tc>
+      </w:tr>
+      <w:tr>
+        <w:tc>
+          <w:tcPr>
+            <w:cnfStyle w:val="001000000000" w:firstRow="0" w:lastRow="0" w:firstColumn="1" w:lastColumn="0" w:oddVBand="0" w:evenVBand="0" w:oddHBand="0" w:evenHBand="0" w:firstRowFirstColumn="0" w:firstRowLastColumn="0" w:lastRowFirstColumn="0" w:lastRowLastColumn="0"/>
+            <w:tcW w:w="0" w:type="auto"/>
+            <w:hideMark/>
+          </w:tcPr>
+          <w:p>
+            <w:pPr>
+              <w:spacing w:after="160" w:line="278" w:lineRule="auto"/>
+            </w:pPr>
+            <w:r>
+              <w:t>04</w:t>
+            </w:r>
+          </w:p>
+        </w:tc>
+        <w:tc>
+          <w:tcPr>
+            <w:tcW w:w="0" w:type="auto"/>
+            <w:hideMark/>
+          </w:tcPr>
+          <w:p>
+            <w:pPr>
+              <w:spacing w:after="160" w:line="278" w:lineRule="auto"/>
+              <w:cnfStyle w:val="000000000000" w:firstRow="0" w:lastRow="0" w:firstColumn="0" w:lastColumn="0" w:oddVBand="0" w:evenVBand="0" w:oddHBand="0" w:evenHBand="0" w:firstRowFirstColumn="0" w:firstRowLastColumn="0" w:lastRowFirstColumn="0" w:lastRowLastColumn="0"/>
+            </w:pPr>
+            <w:r>
+              <w:t>Reserva de viaje</w:t>
+            </w:r>
+          </w:p>
+        </w:tc>
+        <w:tc>
+          <w:tcPr>
+            <w:tcW w:w="0" w:type="auto"/>
+            <w:hideMark/>
+          </w:tcPr>
+          <w:p>
+            <w:pPr>
+              <w:spacing w:after="160" w:line="278" w:lineRule="auto"/>
+              <w:cnfStyle w:val="000000000000" w:firstRow="0" w:lastRow="0" w:firstColumn="0" w:lastColumn="0" w:oddVBand="0" w:evenVBand="0" w:oddHBand="0" w:evenHBand="0" w:firstRowFirstColumn="0" w:firstRowLastColumn="0" w:lastRowFirstColumn="0" w:lastRowLastColumn="0"/>
+            </w:pPr>
+            <w:r>
+              <w:t>Selección de ruta</w:t>
+            </w:r>
+          </w:p>
+        </w:tc>
+        <w:tc>
+          <w:tcPr>
+            <w:tcW w:w="0" w:type="auto"/>
+            <w:hideMark/>
+          </w:tcPr>
+          <w:p>
+            <w:pPr>
+              <w:spacing w:after="160" w:line="278" w:lineRule="auto"/>
+              <w:cnfStyle w:val="000000000000" w:firstRow="0" w:lastRow="0" w:firstColumn="0" w:lastColumn="0" w:oddVBand="0" w:evenVBand="0" w:oddHBand="0" w:evenHBand="0" w:firstRowFirstColumn="0" w:firstRowLastColumn="0" w:lastRowFirstColumn="0" w:lastRowLastColumn="0"/>
+            </w:pPr>
+            <w:r>
+              <w:t>Genera el código QR del boleto</w:t>
+            </w:r>
+          </w:p>
+        </w:tc>
+        <w:tc>
+          <w:tcPr>
+            <w:tcW w:w="0" w:type="auto"/>
+            <w:hideMark/>
+          </w:tcPr>
+          <w:p>
+            <w:pPr>
+              <w:spacing w:after="160" w:line="278" w:lineRule="auto"/>
+              <w:cnfStyle w:val="000000000000" w:firstRow="0" w:lastRow="0" w:firstColumn="0" w:lastColumn="0" w:oddVBand="0" w:evenVBand="0" w:oddHBand="0" w:evenHBand="0" w:firstRowFirstColumn="0" w:firstRowLastColumn="0" w:lastRowFirstColumn="0" w:lastRowLastColumn="0"/>
+            </w:pPr>
+            <w:r>
+              <w:rPr>
+                <w:rFonts w:ascii="Segoe UI Emoji" w:hAnsi="Segoe UI Emoji" w:cs="Segoe UI Emoji"/>
+              </w:rPr>
+              <w:t>✅</w:t>
+            </w:r>
+          </w:p>
+        </w:tc>
+      </w:tr>
+      <w:tr>
+        <w:trPr>
+          <w:cnfStyle w:val="000000100000" w:firstRow="0" w:lastRow="0" w:firstColumn="0" w:lastColumn="0" w:oddVBand="0" w:evenVBand="0" w:oddHBand="1" w:evenHBand="0" w:firstRowFirstColumn="0" w:firstRowLastColumn="0" w:lastRowFirstColumn="0" w:lastRowLastColumn="0"/>
+        </w:trPr>
+        <w:tc>
+          <w:tcPr>
+            <w:cnfStyle w:val="001000000000" w:firstRow="0" w:lastRow="0" w:firstColumn="1" w:lastColumn="0" w:oddVBand="0" w:evenVBand="0" w:oddHBand="0" w:evenHBand="0" w:firstRowFirstColumn="0" w:firstRowLastColumn="0" w:lastRowFirstColumn="0" w:lastRowLastColumn="0"/>
+            <w:tcW w:w="0" w:type="auto"/>
+            <w:hideMark/>
+          </w:tcPr>
+          <w:p>
+            <w:pPr>
+              <w:spacing w:after="160" w:line="278" w:lineRule="auto"/>
+            </w:pPr>
+            <w:r>
+              <w:t>05</w:t>
+            </w:r>
+          </w:p>
+        </w:tc>
+        <w:tc>
+          <w:tcPr>
+            <w:tcW w:w="0" w:type="auto"/>
+            <w:hideMark/>
+          </w:tcPr>
+          <w:p>
+            <w:pPr>
+              <w:spacing w:after="160" w:line="278" w:lineRule="auto"/>
+              <w:cnfStyle w:val="000000100000" w:firstRow="0" w:lastRow="0" w:firstColumn="0" w:lastColumn="0" w:oddVBand="0" w:evenVBand="0" w:oddHBand="1" w:evenHBand="0" w:firstRowFirstColumn="0" w:firstRowLastColumn="0" w:lastRowFirstColumn="0" w:lastRowLastColumn="0"/>
+            </w:pPr>
+            <w:r>
+              <w:t>Sin puntos</w:t>
+            </w:r>
+          </w:p>
+        </w:tc>
+        <w:tc>
+          <w:tcPr>
+            <w:tcW w:w="0" w:type="auto"/>
+            <w:hideMark/>
+          </w:tcPr>
+          <w:p>
+            <w:pPr>
+              <w:spacing w:after="160" w:line="278" w:lineRule="auto"/>
+              <w:cnfStyle w:val="000000100000" w:firstRow="0" w:lastRow="0" w:firstColumn="0" w:lastColumn="0" w:oddVBand="0" w:evenVBand="0" w:oddHBand="1" w:evenHBand="0" w:firstRowFirstColumn="0" w:firstRowLastColumn="0" w:lastRowFirstColumn="0" w:lastRowLastColumn="0"/>
+            </w:pPr>
+            <w:r>
+              <w:t>Reservar con 0 saldo</w:t>
+            </w:r>
+          </w:p>
+        </w:tc>
+        <w:tc>
+          <w:tcPr>
+            <w:tcW w:w="0" w:type="auto"/>
+            <w:hideMark/>
+          </w:tcPr>
+          <w:p>
+            <w:pPr>
+              <w:spacing w:after="160" w:line="278" w:lineRule="auto"/>
+              <w:cnfStyle w:val="000000100000" w:firstRow="0" w:lastRow="0" w:firstColumn="0" w:lastColumn="0" w:oddVBand="0" w:evenVBand="0" w:oddHBand="1" w:evenHBand="0" w:firstRowFirstColumn="0" w:firstRowLastColumn="0" w:lastRowFirstColumn="0" w:lastRowLastColumn="0"/>
+            </w:pPr>
+            <w:r>
+              <w:t>Muestra "Saldo insuficiente"</w:t>
+            </w:r>
+          </w:p>
+        </w:tc>
+        <w:tc>
+          <w:tcPr>
+            <w:tcW w:w="0" w:type="auto"/>
+            <w:hideMark/>
+          </w:tcPr>
+          <w:p>
+            <w:pPr>
+              <w:spacing w:after="160" w:line="278" w:lineRule="auto"/>
+              <w:cnfStyle w:val="000000100000" w:firstRow="0" w:lastRow="0" w:firstColumn="0" w:lastColumn="0" w:oddVBand="0" w:evenVBand="0" w:oddHBand="1" w:evenHBand="0" w:firstRowFirstColumn="0" w:firstRowLastColumn="0" w:lastRowFirstColumn="0" w:lastRowLastColumn="0"/>
+            </w:pPr>
+            <w:r>
+              <w:rPr>
+                <w:rFonts w:ascii="Segoe UI Emoji" w:hAnsi="Segoe UI Emoji" w:cs="Segoe UI Emoji"/>
+              </w:rPr>
+              <w:t>✅</w:t>
+            </w:r>
+          </w:p>
+        </w:tc>
+      </w:tr>
+    </w:tbl>
+    <w:p>
+      <w:pPr>
+        <w:jc w:val="both"/>
+        <w:rPr>
+          <w:rFonts w:ascii="Arial" w:hAnsi="Arial" w:cs="Arial"/>
+          <w:sz w:val="24"/>
+          <w:szCs w:val="24"/>
+        </w:rPr>
+      </w:pPr>
+    </w:p>
+    <w:p>
+      <w:pPr>
+        <w:rPr>
+          <w:b/>
+          <w:bCs/>
+        </w:rPr>
+      </w:pPr>
+      <w:r>
+        <w:rPr>
+          <w:b/>
+          <w:bCs/>
+        </w:rPr>
+        <w:t>Pruebas Unitarias (</w:t>
+      </w:r>
+      <w:proofErr w:type="spellStart"/>
+      <w:r>
+        <w:rPr>
+          <w:b/>
+          <w:bCs/>
+        </w:rPr>
+        <w:t>JUnit</w:t>
+      </w:r>
+      <w:proofErr w:type="spellEnd"/>
+      <w:r>
+        <w:rPr>
+          <w:b/>
+          <w:bCs/>
+        </w:rPr>
+        <w:t>)</w:t>
+      </w:r>
+    </w:p>
+    <w:p>
+      <w:r>
+        <w:t xml:space="preserve">Para asegurar que el código no falle "por dentro", tradujimos la lógica a Java y aplicamos </w:t>
+      </w:r>
+      <w:proofErr w:type="spellStart"/>
+      <w:r>
+        <w:t>JUnit</w:t>
+      </w:r>
+      <w:proofErr w:type="spellEnd"/>
+      <w:r>
+        <w:t>.</w:t>
+      </w:r>
+    </w:p>
+    <w:p>
+      <w:r>
+        <w:rPr>
+          <w:b/>
+          <w:bCs/>
+        </w:rPr>
+        <w:t>Resultado técnico:</w:t>
+      </w:r>
+    </w:p>
+    <w:p>
+      <w:pPr>
+        <w:numPr>
+          <w:ilvl w:val="0"/>
+          <w:numId w:val="1"/>
+        </w:numPr>
+        <w:spacing w:line="278" w:lineRule="auto"/>
+      </w:pPr>
+      <w:r>
+        <w:rPr>
+          <w:b/>
+          <w:bCs/>
+        </w:rPr>
+        <w:t>Herramienta:</w:t>
+      </w:r>
+      <w:r>
+        <w:t xml:space="preserve"> </w:t>
+      </w:r>
+      <w:proofErr w:type="spellStart"/>
+      <w:r>
+        <w:t>JUnit</w:t>
+      </w:r>
+      <w:proofErr w:type="spellEnd"/>
+      <w:r>
+        <w:t xml:space="preserve"> 5/6.</w:t>
+      </w:r>
+    </w:p>
+    <w:p>
+      <w:pPr>
+        <w:numPr>
+          <w:ilvl w:val="0"/>
+          <w:numId w:val="1"/>
+        </w:numPr>
+        <w:spacing w:line="278" w:lineRule="auto"/>
+      </w:pPr>
+      <w:r>
+        <w:rPr>
+          <w:b/>
+          <w:bCs/>
+        </w:rPr>
+        <w:t>Evidencia:</w:t>
+      </w:r>
+      <w:r>
+        <w:t xml:space="preserve"> Se ejecutaron </w:t>
+      </w:r>
+      <w:r>
+        <w:rPr>
+          <w:b/>
+          <w:bCs/>
+        </w:rPr>
+        <w:t>5 pruebas automatizadas</w:t>
+      </w:r>
+      <w:r>
+        <w:t xml:space="preserve"> en Android Studio.</w:t>
+      </w:r>
+    </w:p>
+    <w:p>
+      <w:pPr>
+        <w:numPr>
+          <w:ilvl w:val="0"/>
+          <w:numId w:val="1"/>
+        </w:numPr>
+        <w:spacing w:line="278" w:lineRule="auto"/>
+      </w:pPr>
+      <w:r>
+        <w:rPr>
+          <w:b/>
+          <w:bCs/>
+        </w:rPr>
+        <w:lastRenderedPageBreak/>
+        <w:t>Estado final:</w:t>
+      </w:r>
+      <w:r>
+        <w:t xml:space="preserve"> </w:t>
+      </w:r>
+      <w:r>
+        <w:rPr>
+          <w:b/>
+          <w:bCs/>
+        </w:rPr>
+        <w:t>EXITOSO (BUILD SUCCESSFUL)</w:t>
+      </w:r>
+      <w:r>
+        <w:t>. Ninguna prueba falló, lo que garantiza que la lógica de reserva es segura.</w:t>
+      </w:r>
+    </w:p>
+    <w:p>
+      <w:pPr>
+        <w:jc w:val="both"/>
+        <w:rPr>
+          <w:rFonts w:ascii="Arial" w:hAnsi="Arial" w:cs="Arial"/>
+          <w:sz w:val="24"/>
+          <w:szCs w:val="24"/>
+        </w:rPr>
+      </w:pPr>
+      <w:r>
+        <w:rPr>
+          <w:noProof/>
+        </w:rPr>
+        <w:drawing>
+          <wp:inline distT="0" distB="0" distL="0" distR="0" wp14:anchorId="43296740" wp14:editId="7C087D16">
+            <wp:extent cx="4271594" cy="2210435"/>
+            <wp:effectExtent l="0" t="0" r="0" b="0"/>
+            <wp:docPr id="1077810016" name="Imagen 1"/>
+            <wp:cNvGraphicFramePr>
+              <a:graphicFrameLocks xmlns:a="http://schemas.openxmlformats.org/drawingml/2006/main" noChangeAspect="1"/>
+            </wp:cNvGraphicFramePr>
+            <a:graphic xmlns:a="http://schemas.openxmlformats.org/drawingml/2006/main">
+              <a:graphicData uri="http://schemas.openxmlformats.org/drawingml/2006/picture">
+                <pic:pic xmlns:pic="http://schemas.openxmlformats.org/drawingml/2006/picture">
+                  <pic:nvPicPr>
+                    <pic:cNvPr id="1077810016" name="Imagen 1077810016"/>
+                    <pic:cNvPicPr/>
+                  </pic:nvPicPr>
+                  <pic:blipFill rotWithShape="1">
+                    <a:blip r:embed="rId6" cstate="print">
+                      <a:extLst>
+                        <a:ext uri="{28A0092B-C50C-407E-A947-70E740481C1C}">
+                          <a14:useLocalDpi xmlns:a14="http://schemas.microsoft.com/office/drawing/2010/main" val="0"/>
+                        </a:ext>
+                      </a:extLst>
+                    </a:blip>
+                    <a:srcRect l="17243"/>
+                    <a:stretch>
+                      <a:fillRect/>
+                    </a:stretch>
+                  </pic:blipFill>
+                  <pic:spPr bwMode="auto">
+                    <a:xfrm>
+                      <a:off x="0" y="0"/>
+                      <a:ext cx="4278995" cy="2214265"/>
+                    </a:xfrm>
+                    <a:prstGeom prst="rect">
+                      <a:avLst/>
+                    </a:prstGeom>
+                    <a:ln>
+                      <a:noFill/>
+                    </a:ln>
+                    <a:extLst>
+                      <a:ext uri="{53640926-AAD7-44D8-BBD7-CCE9431645EC}">
+                        <a14:shadowObscured xmlns:a14="http://schemas.microsoft.com/office/drawing/2010/main"/>
+                      </a:ext>
+                    </a:extLst>
+                  </pic:spPr>
+                </pic:pic>
+              </a:graphicData>
+            </a:graphic>
+          </wp:inline>
+        </w:drawing>
+      </w:r>
+    </w:p>
+    <w:p>
+      <w:pPr>
+        <w:jc w:val="both"/>
+        <w:rPr>
+          <w:rFonts w:ascii="Arial" w:hAnsi="Arial" w:cs="Arial"/>
+          <w:b/>
+          <w:bCs/>
+          <w:sz w:val="28"/>
+          <w:szCs w:val="28"/>
+        </w:rPr>
+      </w:pPr>
+      <w:r>
+        <w:rPr>
+          <w:rFonts w:ascii="Arial" w:hAnsi="Arial" w:cs="Arial"/>
+          <w:b/>
+          <w:bCs/>
+          <w:sz w:val="28"/>
+          <w:szCs w:val="28"/>
+        </w:rPr>
+        <w:t>Prue</w:t>
+      </w:r>
+      <w:r>
+        <w:rPr>
+          <w:rFonts w:ascii="Arial" w:hAnsi="Arial" w:cs="Arial"/>
+          <w:b/>
+          <w:bCs/>
+          <w:sz w:val="28"/>
+          <w:szCs w:val="28"/>
+        </w:rPr>
+        <w:t>b</w:t>
+      </w:r>
+      <w:r>
+        <w:rPr>
+          <w:rFonts w:ascii="Arial" w:hAnsi="Arial" w:cs="Arial"/>
+          <w:b/>
+          <w:bCs/>
+          <w:sz w:val="28"/>
+          <w:szCs w:val="28"/>
+        </w:rPr>
+        <w:t xml:space="preserve">a de automatización con la herramienta </w:t>
+      </w:r>
+      <w:proofErr w:type="spellStart"/>
+      <w:r>
+        <w:rPr>
+          <w:rFonts w:ascii="Arial" w:hAnsi="Arial" w:cs="Arial"/>
+          <w:b/>
+          <w:bCs/>
+          <w:sz w:val="28"/>
+          <w:szCs w:val="28"/>
+        </w:rPr>
+        <w:t>APIDocs</w:t>
+      </w:r>
+      <w:proofErr w:type="spellEnd"/>
+    </w:p>
+    <w:p>
+      <w:pPr>
+        <w:rPr>
+          <w:b/>
+          <w:bCs/>
+          <w:i/>
+          <w:iCs/>
+          <w:sz w:val="32"/>
+          <w:szCs w:val="32"/>
+        </w:rPr>
+      </w:pPr>
+      <w:r>
+        <w:rPr>
+          <w:b/>
+          <w:bCs/>
+          <w:i/>
+          <w:iCs/>
+          <w:noProof/>
+          <w:sz w:val="32"/>
+          <w:szCs w:val="32"/>
+        </w:rPr>
+        <w:drawing>
+          <wp:anchor distT="0" distB="0" distL="114300" distR="114300" simplePos="0" relativeHeight="251661312" behindDoc="0" locked="0" layoutInCell="1" allowOverlap="1" wp14:anchorId="748B81C7" wp14:editId="05BE9937">
+            <wp:simplePos x="0" y="0"/>
+            <wp:positionH relativeFrom="margin">
+              <wp:align>center</wp:align>
+            </wp:positionH>
+            <wp:positionV relativeFrom="paragraph">
+              <wp:posOffset>461645</wp:posOffset>
+            </wp:positionV>
+            <wp:extent cx="6844030" cy="3634442"/>
+            <wp:effectExtent l="0" t="0" r="0" b="4445"/>
+            <wp:wrapNone/>
+            <wp:docPr id="2" name="Imagen 2"/>
+            <wp:cNvGraphicFramePr>
+              <a:graphicFrameLocks xmlns:a="http://schemas.openxmlformats.org/drawingml/2006/main" noChangeAspect="1"/>
+            </wp:cNvGraphicFramePr>
+            <a:graphic xmlns:a="http://schemas.openxmlformats.org/drawingml/2006/main">
+              <a:graphicData uri="http://schemas.openxmlformats.org/drawingml/2006/picture">
+                <pic:pic xmlns:pic="http://schemas.openxmlformats.org/drawingml/2006/picture">
+                  <pic:nvPicPr>
+                    <pic:cNvPr id="2" name="Imagen 2"/>
+                    <pic:cNvPicPr/>
+                  </pic:nvPicPr>
+                  <pic:blipFill>
+                    <a:blip r:embed="rId7" cstate="print">
+                      <a:extLst>
+                        <a:ext uri="{28A0092B-C50C-407E-A947-70E740481C1C}">
+                          <a14:useLocalDpi xmlns:a14="http://schemas.microsoft.com/office/drawing/2010/main" val="0"/>
+                        </a:ext>
+                      </a:extLst>
+                    </a:blip>
+                    <a:stretch>
+                      <a:fillRect/>
+                    </a:stretch>
+                  </pic:blipFill>
+                  <pic:spPr>
+                    <a:xfrm>
+                      <a:off x="0" y="0"/>
+                      <a:ext cx="6844030" cy="3634442"/>
+                    </a:xfrm>
+                    <a:prstGeom prst="rect">
+                      <a:avLst/>
+                    </a:prstGeom>
+                  </pic:spPr>
+                </pic:pic>
+              </a:graphicData>
+            </a:graphic>
+            <wp14:sizeRelH relativeFrom="margin">
+              <wp14:pctWidth>0</wp14:pctWidth>
+            </wp14:sizeRelH>
+            <wp14:sizeRelV relativeFrom="margin">
+              <wp14:pctHeight>0</wp14:pctHeight>
+            </wp14:sizeRelV>
+          </wp:anchor>
+        </w:drawing>
+      </w:r>
+      <w:r>
+        <w:rPr>
+          <w:b/>
+          <w:bCs/>
+          <w:i/>
+          <w:iCs/>
+          <w:sz w:val="32"/>
+          <w:szCs w:val="32"/>
+        </w:rPr>
+        <w:t xml:space="preserve">Evidencias de pruebas de automatización </w:t>
+      </w:r>
+    </w:p>
+    <w:p>
+      <w:pPr>
+        <w:rPr>
+          <w:b/>
+          <w:bCs/>
+          <w:i/>
+          <w:iCs/>
+          <w:sz w:val="32"/>
+          <w:szCs w:val="32"/>
+        </w:rPr>
+      </w:pPr>
+    </w:p>
+    <w:p>
+      <w:pPr>
+        <w:rPr>
+          <w:b/>
+          <w:bCs/>
+          <w:i/>
+          <w:iCs/>
+          <w:sz w:val="32"/>
+          <w:szCs w:val="32"/>
+        </w:rPr>
+      </w:pPr>
+    </w:p>
+    <w:p>
+      <w:pPr>
+        <w:rPr>
+          <w:b/>
+          <w:bCs/>
+          <w:i/>
+          <w:iCs/>
+          <w:sz w:val="32"/>
+          <w:szCs w:val="32"/>
+        </w:rPr>
+      </w:pPr>
+    </w:p>
+    <w:p>
+      <w:pPr>
+        <w:rPr>
+          <w:b/>
+          <w:bCs/>
+          <w:i/>
+          <w:iCs/>
+          <w:sz w:val="32"/>
+          <w:szCs w:val="32"/>
+        </w:rPr>
+      </w:pPr>
+    </w:p>
+    <w:p>
+      <w:pPr>
+        <w:rPr>
+          <w:b/>
+          <w:bCs/>
+          <w:i/>
+          <w:iCs/>
+          <w:sz w:val="32"/>
+          <w:szCs w:val="32"/>
+        </w:rPr>
+      </w:pPr>
+    </w:p>
+    <w:p>
+      <w:pPr>
+        <w:rPr>
+          <w:b/>
+          <w:bCs/>
+          <w:i/>
+          <w:iCs/>
+          <w:sz w:val="32"/>
+          <w:szCs w:val="32"/>
+        </w:rPr>
+      </w:pPr>
+    </w:p>
+    <w:p>
+      <w:pPr>
+        <w:rPr>
+          <w:b/>
+          <w:bCs/>
+          <w:i/>
+          <w:iCs/>
+          <w:sz w:val="32"/>
+          <w:szCs w:val="32"/>
+        </w:rPr>
+      </w:pPr>
+    </w:p>
+    <w:p>
+      <w:pPr>
+        <w:rPr>
+          <w:b/>
+          <w:bCs/>
+          <w:i/>
+          <w:iCs/>
+          <w:sz w:val="32"/>
+          <w:szCs w:val="32"/>
+        </w:rPr>
+      </w:pPr>
+    </w:p>
+    <w:p>
+      <w:pPr>
+        <w:rPr>
+          <w:b/>
+          <w:bCs/>
+          <w:i/>
+          <w:iCs/>
+          <w:sz w:val="32"/>
+          <w:szCs w:val="32"/>
+        </w:rPr>
+      </w:pPr>
+    </w:p>
+    <w:p>
+      <w:pPr>
+        <w:rPr>
+          <w:b/>
+          <w:bCs/>
+          <w:i/>
+          <w:iCs/>
+          <w:sz w:val="32"/>
+          <w:szCs w:val="32"/>
+        </w:rPr>
+      </w:pPr>
+    </w:p>
+    <w:p>
+      <w:pPr>
+        <w:rPr>
+          <w:b/>
+          <w:bCs/>
+          <w:i/>
+          <w:iCs/>
+          <w:sz w:val="32"/>
+          <w:szCs w:val="32"/>
+        </w:rPr>
+      </w:pPr>
+    </w:p>
+    <w:p>
+      <w:pPr>
+        <w:rPr>
+          <w:b/>
+          <w:bCs/>
+          <w:i/>
+          <w:iCs/>
+          <w:sz w:val="32"/>
+          <w:szCs w:val="32"/>
+        </w:rPr>
+      </w:pPr>
+    </w:p>
+    <w:p>
+      <w:pPr>
+        <w:rPr>
+          <w:b/>
+          <w:bCs/>
+          <w:i/>
+          <w:iCs/>
+          <w:sz w:val="32"/>
+          <w:szCs w:val="32"/>
+        </w:rPr>
+      </w:pPr>
+    </w:p>
+    <w:p>
+      <w:pPr>
+        <w:rPr>
+          <w:b/>
+          <w:bCs/>
+          <w:i/>
+          <w:iCs/>
+          <w:sz w:val="32"/>
+          <w:szCs w:val="32"/>
+        </w:rPr>
+      </w:pPr>
+      <w:r>
+        <w:rPr>
+          <w:b/>
+          <w:bCs/>
+          <w:i/>
+          <w:iCs/>
+          <w:noProof/>
+          <w:sz w:val="32"/>
+          <w:szCs w:val="32"/>
+        </w:rPr>
+        <w:lastRenderedPageBreak/>
+        <w:drawing>
+          <wp:anchor distT="0" distB="0" distL="114300" distR="114300" simplePos="0" relativeHeight="251660288" behindDoc="0" locked="0" layoutInCell="1" allowOverlap="1" wp14:anchorId="21092AF9" wp14:editId="5B3119FB">
+            <wp:simplePos x="0" y="0"/>
+            <wp:positionH relativeFrom="margin">
+              <wp:posOffset>-356236</wp:posOffset>
+            </wp:positionH>
+            <wp:positionV relativeFrom="paragraph">
+              <wp:posOffset>-233045</wp:posOffset>
+            </wp:positionV>
+            <wp:extent cx="6369685" cy="3159760"/>
+            <wp:effectExtent l="0" t="0" r="0" b="2540"/>
+            <wp:wrapNone/>
+            <wp:docPr id="1" name="Imagen 1"/>
+            <wp:cNvGraphicFramePr>
+              <a:graphicFrameLocks xmlns:a="http://schemas.openxmlformats.org/drawingml/2006/main" noChangeAspect="1"/>
+            </wp:cNvGraphicFramePr>
+            <a:graphic xmlns:a="http://schemas.openxmlformats.org/drawingml/2006/main">
+              <a:graphicData uri="http://schemas.openxmlformats.org/drawingml/2006/picture">
+                <pic:pic xmlns:pic="http://schemas.openxmlformats.org/drawingml/2006/picture">
+                  <pic:nvPicPr>
+                    <pic:cNvPr id="1" name="Imagen 1"/>
+                    <pic:cNvPicPr/>
+                  </pic:nvPicPr>
+                  <pic:blipFill>
+                    <a:blip r:embed="rId8" cstate="print">
+                      <a:extLst>
+                        <a:ext uri="{28A0092B-C50C-407E-A947-70E740481C1C}">
+                          <a14:useLocalDpi xmlns:a14="http://schemas.microsoft.com/office/drawing/2010/main" val="0"/>
+                        </a:ext>
+                      </a:extLst>
+                    </a:blip>
+                    <a:stretch>
+                      <a:fillRect/>
+                    </a:stretch>
+                  </pic:blipFill>
+                  <pic:spPr>
+                    <a:xfrm>
+                      <a:off x="0" y="0"/>
+                      <a:ext cx="6370780" cy="3160303"/>
+                    </a:xfrm>
+                    <a:prstGeom prst="rect">
+                      <a:avLst/>
+                    </a:prstGeom>
+                  </pic:spPr>
+                </pic:pic>
+              </a:graphicData>
+            </a:graphic>
+            <wp14:sizeRelH relativeFrom="margin">
+              <wp14:pctWidth>0</wp14:pctWidth>
+            </wp14:sizeRelH>
+            <wp14:sizeRelV relativeFrom="margin">
+              <wp14:pctHeight>0</wp14:pctHeight>
+            </wp14:sizeRelV>
+          </wp:anchor>
+        </w:drawing>
+      </w:r>
+    </w:p>
+    <w:p>
+      <w:pPr>
+        <w:rPr>
+          <w:b/>
+          <w:bCs/>
+          <w:i/>
+          <w:iCs/>
+          <w:noProof/>
+          <w:sz w:val="32"/>
+          <w:szCs w:val="32"/>
+        </w:rPr>
+      </w:pPr>
+    </w:p>
+    <w:p>
+      <w:pPr>
+        <w:rPr>
+          <w:b/>
+          <w:bCs/>
+          <w:i/>
+          <w:iCs/>
+          <w:noProof/>
+          <w:sz w:val="32"/>
+          <w:szCs w:val="32"/>
+        </w:rPr>
+      </w:pPr>
+    </w:p>
+    <w:p>
+      <w:pPr>
+        <w:rPr>
+          <w:b/>
+          <w:bCs/>
+          <w:i/>
+          <w:iCs/>
+          <w:noProof/>
+          <w:sz w:val="32"/>
+          <w:szCs w:val="32"/>
+        </w:rPr>
+      </w:pPr>
+    </w:p>
+    <w:p>
+      <w:pPr>
+        <w:rPr>
+          <w:b/>
+          <w:bCs/>
+          <w:i/>
+          <w:iCs/>
+          <w:noProof/>
+          <w:sz w:val="32"/>
+          <w:szCs w:val="32"/>
+        </w:rPr>
+      </w:pPr>
+    </w:p>
+    <w:p>
+      <w:pPr>
+        <w:rPr>
+          <w:b/>
+          <w:bCs/>
+          <w:i/>
+          <w:iCs/>
+          <w:noProof/>
+          <w:sz w:val="32"/>
+          <w:szCs w:val="32"/>
+        </w:rPr>
+      </w:pPr>
+    </w:p>
+    <w:p>
+      <w:pPr>
+        <w:rPr>
+          <w:b/>
+          <w:bCs/>
+          <w:i/>
+          <w:iCs/>
+          <w:noProof/>
+          <w:sz w:val="32"/>
+          <w:szCs w:val="32"/>
+        </w:rPr>
+      </w:pPr>
+    </w:p>
+    <w:p>
+      <w:pPr>
+        <w:rPr>
+          <w:b/>
+          <w:bCs/>
+          <w:i/>
+          <w:iCs/>
+          <w:noProof/>
+          <w:sz w:val="32"/>
+          <w:szCs w:val="32"/>
+        </w:rPr>
+      </w:pPr>
+    </w:p>
+    <w:p>
+      <w:pPr>
+        <w:rPr>
+          <w:b/>
+          <w:bCs/>
+          <w:i/>
+          <w:iCs/>
+          <w:noProof/>
+          <w:sz w:val="32"/>
+          <w:szCs w:val="32"/>
+        </w:rPr>
+      </w:pPr>
+      <w:r>
+        <w:rPr>
+          <w:b/>
+          <w:bCs/>
+          <w:i/>
+          <w:iCs/>
+          <w:noProof/>
+          <w:sz w:val="32"/>
+          <w:szCs w:val="32"/>
+        </w:rPr>
+        <w:drawing>
+          <wp:anchor distT="0" distB="0" distL="114300" distR="114300" simplePos="0" relativeHeight="251664384" behindDoc="0" locked="0" layoutInCell="1" allowOverlap="1" wp14:anchorId="595F4FC0" wp14:editId="5F65B080">
+            <wp:simplePos x="0" y="0"/>
+            <wp:positionH relativeFrom="margin">
+              <wp:posOffset>-413385</wp:posOffset>
+            </wp:positionH>
+            <wp:positionV relativeFrom="paragraph">
+              <wp:posOffset>184786</wp:posOffset>
+            </wp:positionV>
+            <wp:extent cx="6426835" cy="3371850"/>
+            <wp:effectExtent l="0" t="0" r="0" b="0"/>
+            <wp:wrapNone/>
+            <wp:docPr id="6" name="Imagen 6"/>
+            <wp:cNvGraphicFramePr>
+              <a:graphicFrameLocks xmlns:a="http://schemas.openxmlformats.org/drawingml/2006/main" noChangeAspect="1"/>
+            </wp:cNvGraphicFramePr>
+            <a:graphic xmlns:a="http://schemas.openxmlformats.org/drawingml/2006/main">
+              <a:graphicData uri="http://schemas.openxmlformats.org/drawingml/2006/picture">
+                <pic:pic xmlns:pic="http://schemas.openxmlformats.org/drawingml/2006/picture">
+                  <pic:nvPicPr>
+                    <pic:cNvPr id="6" name="Imagen 6"/>
+                    <pic:cNvPicPr/>
+                  </pic:nvPicPr>
+                  <pic:blipFill>
+                    <a:blip r:embed="rId9" cstate="print">
+                      <a:extLst>
+                        <a:ext uri="{28A0092B-C50C-407E-A947-70E740481C1C}">
+                          <a14:useLocalDpi xmlns:a14="http://schemas.microsoft.com/office/drawing/2010/main" val="0"/>
+                        </a:ext>
+                      </a:extLst>
+                    </a:blip>
+                    <a:stretch>
+                      <a:fillRect/>
+                    </a:stretch>
+                  </pic:blipFill>
+                  <pic:spPr>
+                    <a:xfrm>
+                      <a:off x="0" y="0"/>
+                      <a:ext cx="6426835" cy="3371850"/>
+                    </a:xfrm>
+                    <a:prstGeom prst="rect">
+                      <a:avLst/>
+                    </a:prstGeom>
+                  </pic:spPr>
+                </pic:pic>
+              </a:graphicData>
+            </a:graphic>
+            <wp14:sizeRelH relativeFrom="margin">
+              <wp14:pctWidth>0</wp14:pctWidth>
+            </wp14:sizeRelH>
+            <wp14:sizeRelV relativeFrom="margin">
+              <wp14:pctHeight>0</wp14:pctHeight>
+            </wp14:sizeRelV>
+          </wp:anchor>
+        </w:drawing>
+      </w:r>
+    </w:p>
+    <w:p>
+      <w:pPr>
+        <w:rPr>
+          <w:b/>
+          <w:bCs/>
+          <w:i/>
+          <w:iCs/>
+          <w:noProof/>
+          <w:sz w:val="32"/>
+          <w:szCs w:val="32"/>
+        </w:rPr>
+      </w:pPr>
+    </w:p>
+    <w:p>
+      <w:pPr>
+        <w:rPr>
+          <w:b/>
+          <w:bCs/>
+          <w:i/>
+          <w:iCs/>
+          <w:noProof/>
+          <w:sz w:val="32"/>
+          <w:szCs w:val="32"/>
+        </w:rPr>
+      </w:pPr>
+    </w:p>
+    <w:p>
+      <w:pPr>
+        <w:rPr>
+          <w:b/>
+          <w:bCs/>
+          <w:i/>
+          <w:iCs/>
+          <w:noProof/>
+          <w:sz w:val="32"/>
+          <w:szCs w:val="32"/>
+        </w:rPr>
+      </w:pPr>
+    </w:p>
+    <w:p>
+      <w:pPr>
+        <w:rPr>
+          <w:b/>
+          <w:bCs/>
+          <w:i/>
+          <w:iCs/>
+          <w:noProof/>
+          <w:sz w:val="32"/>
+          <w:szCs w:val="32"/>
+        </w:rPr>
+      </w:pPr>
+    </w:p>
+    <w:p>
+      <w:pPr>
+        <w:rPr>
+          <w:b/>
+          <w:bCs/>
+          <w:i/>
+          <w:iCs/>
+          <w:noProof/>
+          <w:sz w:val="32"/>
+          <w:szCs w:val="32"/>
+        </w:rPr>
+      </w:pPr>
+    </w:p>
+    <w:p>
+      <w:pPr>
+        <w:rPr>
+          <w:b/>
+          <w:bCs/>
+          <w:i/>
+          <w:iCs/>
+          <w:noProof/>
+          <w:sz w:val="32"/>
+          <w:szCs w:val="32"/>
+        </w:rPr>
+      </w:pPr>
+    </w:p>
+    <w:p>
+      <w:pPr>
+        <w:rPr>
+          <w:b/>
+          <w:bCs/>
+          <w:i/>
+          <w:iCs/>
+          <w:noProof/>
+          <w:sz w:val="32"/>
+          <w:szCs w:val="32"/>
+        </w:rPr>
+      </w:pPr>
+    </w:p>
+    <w:p>
+      <w:pPr>
+        <w:rPr>
+          <w:b/>
+          <w:bCs/>
+          <w:i/>
+          <w:iCs/>
+          <w:noProof/>
+          <w:sz w:val="32"/>
+          <w:szCs w:val="32"/>
+        </w:rPr>
+      </w:pPr>
+    </w:p>
+    <w:p>
+      <w:pPr>
+        <w:rPr>
+          <w:b/>
+          <w:bCs/>
+          <w:i/>
+          <w:iCs/>
+          <w:noProof/>
+          <w:sz w:val="32"/>
+          <w:szCs w:val="32"/>
+        </w:rPr>
+      </w:pPr>
+    </w:p>
+    <w:p>
+      <w:pPr>
+        <w:rPr>
+          <w:b/>
+          <w:bCs/>
+          <w:i/>
+          <w:iCs/>
+          <w:noProof/>
+          <w:sz w:val="32"/>
+          <w:szCs w:val="32"/>
+        </w:rPr>
+      </w:pPr>
+    </w:p>
+    <w:p>
+      <w:pPr>
+        <w:rPr>
+          <w:b/>
+          <w:bCs/>
+          <w:i/>
+          <w:iCs/>
+          <w:noProof/>
+          <w:sz w:val="32"/>
+          <w:szCs w:val="32"/>
+        </w:rPr>
+      </w:pPr>
+    </w:p>
+    <w:p>
+      <w:pPr>
+        <w:rPr>
+          <w:b/>
+          <w:bCs/>
+          <w:i/>
+          <w:iCs/>
+          <w:noProof/>
+          <w:sz w:val="32"/>
+          <w:szCs w:val="32"/>
+        </w:rPr>
+      </w:pPr>
+    </w:p>
+    <w:p>
+      <w:pPr>
+        <w:rPr>
+          <w:b/>
+          <w:bCs/>
+          <w:i/>
+          <w:iCs/>
+          <w:noProof/>
+          <w:sz w:val="32"/>
+          <w:szCs w:val="32"/>
+        </w:rPr>
+      </w:pPr>
+    </w:p>
+    <w:p>
+      <w:pPr>
+        <w:rPr>
+          <w:b/>
+          <w:bCs/>
+          <w:i/>
+          <w:iCs/>
+          <w:noProof/>
+          <w:sz w:val="32"/>
+          <w:szCs w:val="32"/>
+        </w:rPr>
+      </w:pPr>
+      <w:r>
+        <w:rPr>
+          <w:b/>
+          <w:bCs/>
+          <w:i/>
+          <w:iCs/>
+          <w:noProof/>
+          <w:sz w:val="32"/>
+          <w:szCs w:val="32"/>
+        </w:rPr>
+        <w:lastRenderedPageBreak/>
+        <w:drawing>
+          <wp:anchor distT="0" distB="0" distL="114300" distR="114300" simplePos="0" relativeHeight="251662336" behindDoc="0" locked="0" layoutInCell="1" allowOverlap="1" wp14:anchorId="0F721CFF" wp14:editId="35497DA3">
+            <wp:simplePos x="0" y="0"/>
+            <wp:positionH relativeFrom="margin">
+              <wp:posOffset>-318135</wp:posOffset>
+            </wp:positionH>
+            <wp:positionV relativeFrom="paragraph">
+              <wp:posOffset>14605</wp:posOffset>
+            </wp:positionV>
+            <wp:extent cx="6264275" cy="3505200"/>
+            <wp:effectExtent l="0" t="0" r="3175" b="0"/>
+            <wp:wrapNone/>
+            <wp:docPr id="3" name="Imagen 3"/>
+            <wp:cNvGraphicFramePr>
+              <a:graphicFrameLocks xmlns:a="http://schemas.openxmlformats.org/drawingml/2006/main" noChangeAspect="1"/>
+            </wp:cNvGraphicFramePr>
+            <a:graphic xmlns:a="http://schemas.openxmlformats.org/drawingml/2006/main">
+              <a:graphicData uri="http://schemas.openxmlformats.org/drawingml/2006/picture">
+                <pic:pic xmlns:pic="http://schemas.openxmlformats.org/drawingml/2006/picture">
+                  <pic:nvPicPr>
+                    <pic:cNvPr id="3" name="Imagen 3"/>
+                    <pic:cNvPicPr/>
+                  </pic:nvPicPr>
+                  <pic:blipFill>
+                    <a:blip r:embed="rId10" cstate="print">
+                      <a:extLst>
+                        <a:ext uri="{28A0092B-C50C-407E-A947-70E740481C1C}">
+                          <a14:useLocalDpi xmlns:a14="http://schemas.microsoft.com/office/drawing/2010/main" val="0"/>
+                        </a:ext>
+                      </a:extLst>
+                    </a:blip>
+                    <a:stretch>
+                      <a:fillRect/>
+                    </a:stretch>
+                  </pic:blipFill>
+                  <pic:spPr>
+                    <a:xfrm>
+                      <a:off x="0" y="0"/>
+                      <a:ext cx="6264275" cy="3505200"/>
+                    </a:xfrm>
+                    <a:prstGeom prst="rect">
+                      <a:avLst/>
+                    </a:prstGeom>
+                  </pic:spPr>
+                </pic:pic>
+              </a:graphicData>
+            </a:graphic>
+            <wp14:sizeRelH relativeFrom="margin">
+              <wp14:pctWidth>0</wp14:pctWidth>
+            </wp14:sizeRelH>
+            <wp14:sizeRelV relativeFrom="margin">
+              <wp14:pctHeight>0</wp14:pctHeight>
+            </wp14:sizeRelV>
+          </wp:anchor>
+        </w:drawing>
+      </w:r>
+    </w:p>
+    <w:p>
+      <w:pPr>
+        <w:rPr>
+          <w:b/>
+          <w:bCs/>
+          <w:i/>
+          <w:iCs/>
+          <w:noProof/>
+          <w:sz w:val="32"/>
+          <w:szCs w:val="32"/>
+        </w:rPr>
+      </w:pPr>
+    </w:p>
+    <w:p>
+      <w:pPr>
+        <w:rPr>
+          <w:b/>
+          <w:bCs/>
+          <w:i/>
+          <w:iCs/>
+          <w:noProof/>
+          <w:sz w:val="32"/>
+          <w:szCs w:val="32"/>
+        </w:rPr>
+      </w:pPr>
+    </w:p>
+    <w:p>
+      <w:pPr>
+        <w:rPr>
+          <w:b/>
+          <w:bCs/>
+          <w:i/>
+          <w:iCs/>
+          <w:noProof/>
+          <w:sz w:val="32"/>
+          <w:szCs w:val="32"/>
+        </w:rPr>
+      </w:pPr>
+    </w:p>
+    <w:p>
+      <w:pPr>
+        <w:rPr>
+          <w:b/>
+          <w:bCs/>
+          <w:i/>
+          <w:iCs/>
+          <w:noProof/>
+          <w:sz w:val="32"/>
+          <w:szCs w:val="32"/>
+        </w:rPr>
+      </w:pPr>
+    </w:p>
+    <w:p>
+      <w:pPr>
+        <w:rPr>
+          <w:b/>
+          <w:bCs/>
+          <w:i/>
+          <w:iCs/>
+          <w:noProof/>
+          <w:sz w:val="32"/>
+          <w:szCs w:val="32"/>
+        </w:rPr>
+      </w:pPr>
+    </w:p>
+    <w:p>
+      <w:pPr>
+        <w:rPr>
+          <w:b/>
+          <w:bCs/>
+          <w:i/>
+          <w:iCs/>
+          <w:noProof/>
+          <w:sz w:val="32"/>
+          <w:szCs w:val="32"/>
+        </w:rPr>
+      </w:pPr>
+    </w:p>
+    <w:p>
+      <w:pPr>
+        <w:rPr>
+          <w:b/>
+          <w:bCs/>
+          <w:i/>
+          <w:iCs/>
+          <w:noProof/>
+          <w:sz w:val="32"/>
+          <w:szCs w:val="32"/>
+        </w:rPr>
+      </w:pPr>
+    </w:p>
+    <w:p>
+      <w:pPr>
+        <w:rPr>
+          <w:b/>
+          <w:bCs/>
+          <w:i/>
+          <w:iCs/>
+          <w:noProof/>
+          <w:sz w:val="32"/>
+          <w:szCs w:val="32"/>
+        </w:rPr>
+      </w:pPr>
+    </w:p>
+    <w:p>
+      <w:pPr>
+        <w:rPr>
+          <w:b/>
+          <w:bCs/>
+          <w:i/>
+          <w:iCs/>
+          <w:noProof/>
+          <w:sz w:val="32"/>
+          <w:szCs w:val="32"/>
+        </w:rPr>
+      </w:pPr>
+    </w:p>
+    <w:p>
+      <w:pPr>
+        <w:rPr>
+          <w:b/>
+          <w:bCs/>
+          <w:i/>
+          <w:iCs/>
+          <w:noProof/>
+          <w:sz w:val="32"/>
+          <w:szCs w:val="32"/>
+        </w:rPr>
+      </w:pPr>
+      <w:r>
+        <w:rPr>
+          <w:b/>
+          <w:bCs/>
+          <w:i/>
+          <w:iCs/>
+          <w:noProof/>
+          <w:sz w:val="32"/>
+          <w:szCs w:val="32"/>
+        </w:rPr>
+        <w:drawing>
+          <wp:anchor distT="0" distB="0" distL="114300" distR="114300" simplePos="0" relativeHeight="251663360" behindDoc="0" locked="0" layoutInCell="1" allowOverlap="1" wp14:anchorId="4F50BF8B" wp14:editId="5B931996">
+            <wp:simplePos x="0" y="0"/>
+            <wp:positionH relativeFrom="margin">
+              <wp:posOffset>-260985</wp:posOffset>
+            </wp:positionH>
+            <wp:positionV relativeFrom="paragraph">
+              <wp:posOffset>132080</wp:posOffset>
+            </wp:positionV>
+            <wp:extent cx="6076950" cy="3676650"/>
+            <wp:effectExtent l="0" t="0" r="0" b="0"/>
+            <wp:wrapNone/>
+            <wp:docPr id="5" name="Imagen 5"/>
+            <wp:cNvGraphicFramePr>
+              <a:graphicFrameLocks xmlns:a="http://schemas.openxmlformats.org/drawingml/2006/main" noChangeAspect="1"/>
+            </wp:cNvGraphicFramePr>
+            <a:graphic xmlns:a="http://schemas.openxmlformats.org/drawingml/2006/main">
+              <a:graphicData uri="http://schemas.openxmlformats.org/drawingml/2006/picture">
+                <pic:pic xmlns:pic="http://schemas.openxmlformats.org/drawingml/2006/picture">
+                  <pic:nvPicPr>
+                    <pic:cNvPr id="5" name="Imagen 5"/>
+                    <pic:cNvPicPr/>
+                  </pic:nvPicPr>
+                  <pic:blipFill>
+                    <a:blip r:embed="rId11" cstate="print">
+                      <a:extLst>
+                        <a:ext uri="{28A0092B-C50C-407E-A947-70E740481C1C}">
+                          <a14:useLocalDpi xmlns:a14="http://schemas.microsoft.com/office/drawing/2010/main" val="0"/>
+                        </a:ext>
+                      </a:extLst>
+                    </a:blip>
+                    <a:stretch>
+                      <a:fillRect/>
+                    </a:stretch>
+                  </pic:blipFill>
+                  <pic:spPr>
+                    <a:xfrm>
+                      <a:off x="0" y="0"/>
+                      <a:ext cx="6076950" cy="3676650"/>
+                    </a:xfrm>
+                    <a:prstGeom prst="rect">
+                      <a:avLst/>
+                    </a:prstGeom>
+                  </pic:spPr>
+                </pic:pic>
+              </a:graphicData>
+            </a:graphic>
+            <wp14:sizeRelH relativeFrom="margin">
+              <wp14:pctWidth>0</wp14:pctWidth>
+            </wp14:sizeRelH>
+            <wp14:sizeRelV relativeFrom="margin">
+              <wp14:pctHeight>0</wp14:pctHeight>
+            </wp14:sizeRelV>
+          </wp:anchor>
+        </w:drawing>
+      </w:r>
+    </w:p>
+    <w:p>
+      <w:pPr>
+        <w:rPr>
+          <w:b/>
+          <w:bCs/>
+          <w:i/>
+          <w:iCs/>
+          <w:noProof/>
+          <w:sz w:val="32"/>
+          <w:szCs w:val="32"/>
+        </w:rPr>
+      </w:pPr>
+    </w:p>
+    <w:p>
+      <w:pPr>
+        <w:rPr>
+          <w:b/>
+          <w:bCs/>
+          <w:i/>
+          <w:iCs/>
+          <w:noProof/>
+          <w:sz w:val="32"/>
+          <w:szCs w:val="32"/>
+        </w:rPr>
+      </w:pPr>
+    </w:p>
+    <w:p>
+      <w:pPr>
+        <w:rPr>
+          <w:b/>
+          <w:bCs/>
+          <w:i/>
+          <w:iCs/>
+          <w:noProof/>
+          <w:sz w:val="32"/>
+          <w:szCs w:val="32"/>
+        </w:rPr>
+      </w:pPr>
+    </w:p>
+    <w:p>
+      <w:pPr>
+        <w:rPr>
+          <w:b/>
+          <w:bCs/>
+          <w:i/>
+          <w:iCs/>
+          <w:noProof/>
+          <w:sz w:val="32"/>
+          <w:szCs w:val="32"/>
+        </w:rPr>
+      </w:pPr>
+    </w:p>
+    <w:p>
+      <w:pPr>
+        <w:rPr>
+          <w:b/>
+          <w:bCs/>
+          <w:i/>
+          <w:iCs/>
+          <w:noProof/>
+          <w:sz w:val="32"/>
+          <w:szCs w:val="32"/>
+        </w:rPr>
+      </w:pPr>
+    </w:p>
+    <w:p>
+      <w:pPr>
+        <w:rPr>
+          <w:b/>
+          <w:bCs/>
+          <w:i/>
+          <w:iCs/>
+          <w:noProof/>
+          <w:sz w:val="32"/>
+          <w:szCs w:val="32"/>
+        </w:rPr>
+      </w:pPr>
+    </w:p>
+    <w:p>
+      <w:pPr>
+        <w:rPr>
+          <w:b/>
+          <w:bCs/>
+          <w:i/>
+          <w:iCs/>
+          <w:noProof/>
+          <w:sz w:val="32"/>
+          <w:szCs w:val="32"/>
+        </w:rPr>
+      </w:pPr>
+    </w:p>
+    <w:p>
+      <w:pPr>
+        <w:rPr>
+          <w:b/>
+          <w:bCs/>
+          <w:i/>
+          <w:iCs/>
+          <w:sz w:val="32"/>
+          <w:szCs w:val="32"/>
+        </w:rPr>
+      </w:pPr>
+    </w:p>
+    <w:p>
+      <w:pPr>
+        <w:jc w:val="both"/>
+        <w:rPr>
+          <w:rFonts w:ascii="Arial" w:hAnsi="Arial" w:cs="Arial"/>
+          <w:sz w:val="24"/>
+          <w:szCs w:val="24"/>
+        </w:rPr>
+      </w:pPr>
+    </w:p>
     <w:sectPr>
       <w:pgSz w:w="12240" w:h="15840"/>
       <w:pgMar w:top="1417" w:right="1701" w:bottom="1417" w:left="1701" w:header="708" w:footer="708" w:gutter="0"/>
@@ -678,6 +2554,163 @@
     </w:sectPr>
   </w:body>
 </w:document>
+</file>
+
+<file path=word/numbering.xml><?xml version="1.0" encoding="utf-8"?>
+<w:numbering xmlns:wpc="http://schemas.microsoft.com/office/word/2010/wordprocessingCanvas" xmlns:cx="http://schemas.microsoft.com/office/drawing/2014/chartex" xmlns:cx1="http://schemas.microsoft.com/office/drawing/2015/9/8/chartex" xmlns:cx2="http://schemas.microsoft.com/office/drawing/2015/10/21/chartex" xmlns:cx3="http://schemas.microsoft.com/office/drawing/2016/5/9/chartex" xmlns:cx4="http://schemas.microsoft.com/office/drawing/2016/5/10/chartex" xmlns:cx5="http://schemas.microsoft.com/office/drawing/2016/5/11/chartex" xmlns:cx6="http://schemas.microsoft.com/office/drawing/2016/5/12/chartex" xmlns:cx7="http://schemas.microsoft.com/office/drawing/2016/5/13/chartex" xmlns:cx8="http://schemas.microsoft.com/office/drawing/2016/5/14/chartex" xmlns:mc="http://schemas.openxmlformats.org/markup-compatibility/2006" xmlns:aink="http://schemas.microsoft.com/office/drawing/2016/ink" xmlns:am3d="http://schemas.microsoft.com/office/drawing/2017/model3d" xmlns:o="urn:schemas-microsoft-com:office:office" xmlns:oel="http://schemas.microsoft.com/office/2019/extlst" xmlns:r="http://schemas.openxmlformats.org/officeDocument/2006/relationships" xmlns:m="http://schemas.openxmlformats.org/officeDocument/2006/math" xmlns:v="urn:schemas-microsoft-com:vml" xmlns:wp14="http://schemas.microsoft.com/office/word/2010/wordprocessingDrawing" xmlns:wp="http://schemas.openxmlformats.org/drawingml/2006/wordprocessingDrawing" xmlns:w10="urn:schemas-microsoft-com:office:word" xmlns:w="http://schemas.openxmlformats.org/wordprocessingml/2006/main" xmlns:w14="http://schemas.microsoft.com/office/word/2010/wordml" xmlns:w15="http://schemas.microsoft.com/office/word/2012/wordml" xmlns:w16cex="http://schemas.microsoft.com/office/word/2018/wordml/cex" xmlns:w16cid="http://schemas.microsoft.com/office/word/2016/wordml/cid" xmlns:w16="http://schemas.microsoft.com/office/word/2018/wordml" xmlns:w16du="http://schemas.microsoft.com/office/word/2023/wordml/word16du" xmlns:w16sdtdh="http://schemas.microsoft.com/office/word/2020/wordml/sdtdatahash" xmlns:w16sdtfl="http://schemas.microsoft.com/office/word/2024/wordml/sdtformatlock" xmlns:w16se="http://schemas.microsoft.com/office/word/2015/wordml/symex" xmlns:wpg="http://schemas.microsoft.com/office/word/2010/wordprocessingGroup" xmlns:wpi="http://schemas.microsoft.com/office/word/2010/wordprocessingInk" xmlns:wne="http://schemas.microsoft.com/office/word/2006/wordml" xmlns:wps="http://schemas.microsoft.com/office/word/2010/wordprocessingShape" mc:Ignorable="w14 w15 w16se w16cid w16 w16cex w16sdtdh w16sdtfl w16du wp14">
+  <w:abstractNum w:abstractNumId="0" w15:restartNumberingAfterBreak="0">
+    <w:nsid w:val="4FB526A4"/>
+    <w:multiLevelType w:val="multilevel"/>
+    <w:tmpl w:val="52D2D79A"/>
+    <w:lvl w:ilvl="0">
+      <w:start w:val="1"/>
+      <w:numFmt w:val="bullet"/>
+      <w:lvlText w:val=""/>
+      <w:lvlJc w:val="left"/>
+      <w:pPr>
+        <w:tabs>
+          <w:tab w:val="num" w:pos="720"/>
+        </w:tabs>
+        <w:ind w:left="720" w:hanging="360"/>
+      </w:pPr>
+      <w:rPr>
+        <w:rFonts w:ascii="Symbol" w:hAnsi="Symbol" w:hint="default"/>
+        <w:sz w:val="20"/>
+      </w:rPr>
+    </w:lvl>
+    <w:lvl w:ilvl="1" w:tentative="1">
+      <w:start w:val="1"/>
+      <w:numFmt w:val="bullet"/>
+      <w:lvlText w:val="o"/>
+      <w:lvlJc w:val="left"/>
+      <w:pPr>
+        <w:tabs>
+          <w:tab w:val="num" w:pos="1440"/>
+        </w:tabs>
+        <w:ind w:left="1440" w:hanging="360"/>
+      </w:pPr>
+      <w:rPr>
+        <w:rFonts w:ascii="Courier New" w:hAnsi="Courier New" w:hint="default"/>
+        <w:sz w:val="20"/>
+      </w:rPr>
+    </w:lvl>
+    <w:lvl w:ilvl="2" w:tentative="1">
+      <w:start w:val="1"/>
+      <w:numFmt w:val="bullet"/>
+      <w:lvlText w:val=""/>
+      <w:lvlJc w:val="left"/>
+      <w:pPr>
+        <w:tabs>
+          <w:tab w:val="num" w:pos="2160"/>
+        </w:tabs>
+        <w:ind w:left="2160" w:hanging="360"/>
+      </w:pPr>
+      <w:rPr>
+        <w:rFonts w:ascii="Wingdings" w:hAnsi="Wingdings" w:hint="default"/>
+        <w:sz w:val="20"/>
+      </w:rPr>
+    </w:lvl>
+    <w:lvl w:ilvl="3" w:tentative="1">
+      <w:start w:val="1"/>
+      <w:numFmt w:val="bullet"/>
+      <w:lvlText w:val=""/>
+      <w:lvlJc w:val="left"/>
+      <w:pPr>
+        <w:tabs>
+          <w:tab w:val="num" w:pos="2880"/>
+        </w:tabs>
+        <w:ind w:left="2880" w:hanging="360"/>
+      </w:pPr>
+      <w:rPr>
+        <w:rFonts w:ascii="Wingdings" w:hAnsi="Wingdings" w:hint="default"/>
+        <w:sz w:val="20"/>
+      </w:rPr>
+    </w:lvl>
+    <w:lvl w:ilvl="4" w:tentative="1">
+      <w:start w:val="1"/>
+      <w:numFmt w:val="bullet"/>
+      <w:lvlText w:val=""/>
+      <w:lvlJc w:val="left"/>
+      <w:pPr>
+        <w:tabs>
+          <w:tab w:val="num" w:pos="3600"/>
+        </w:tabs>
+        <w:ind w:left="3600" w:hanging="360"/>
+      </w:pPr>
+      <w:rPr>
+        <w:rFonts w:ascii="Wingdings" w:hAnsi="Wingdings" w:hint="default"/>
+        <w:sz w:val="20"/>
+      </w:rPr>
+    </w:lvl>
+    <w:lvl w:ilvl="5" w:tentative="1">
+      <w:start w:val="1"/>
+      <w:numFmt w:val="bullet"/>
+      <w:lvlText w:val=""/>
+      <w:lvlJc w:val="left"/>
+      <w:pPr>
+        <w:tabs>
+          <w:tab w:val="num" w:pos="4320"/>
+        </w:tabs>
+        <w:ind w:left="4320" w:hanging="360"/>
+      </w:pPr>
+      <w:rPr>
+        <w:rFonts w:ascii="Wingdings" w:hAnsi="Wingdings" w:hint="default"/>
+        <w:sz w:val="20"/>
+      </w:rPr>
+    </w:lvl>
+    <w:lvl w:ilvl="6" w:tentative="1">
+      <w:start w:val="1"/>
+      <w:numFmt w:val="bullet"/>
+      <w:lvlText w:val=""/>
+      <w:lvlJc w:val="left"/>
+      <w:pPr>
+        <w:tabs>
+          <w:tab w:val="num" w:pos="5040"/>
+        </w:tabs>
+        <w:ind w:left="5040" w:hanging="360"/>
+      </w:pPr>
+      <w:rPr>
+        <w:rFonts w:ascii="Wingdings" w:hAnsi="Wingdings" w:hint="default"/>
+        <w:sz w:val="20"/>
+      </w:rPr>
+    </w:lvl>
+    <w:lvl w:ilvl="7" w:tentative="1">
+      <w:start w:val="1"/>
+      <w:numFmt w:val="bullet"/>
+      <w:lvlText w:val=""/>
+      <w:lvlJc w:val="left"/>
+      <w:pPr>
+        <w:tabs>
+          <w:tab w:val="num" w:pos="5760"/>
+        </w:tabs>
+        <w:ind w:left="5760" w:hanging="360"/>
+      </w:pPr>
+      <w:rPr>
+        <w:rFonts w:ascii="Wingdings" w:hAnsi="Wingdings" w:hint="default"/>
+        <w:sz w:val="20"/>
+      </w:rPr>
+    </w:lvl>
+    <w:lvl w:ilvl="8" w:tentative="1">
+      <w:start w:val="1"/>
+      <w:numFmt w:val="bullet"/>
+      <w:lvlText w:val=""/>
+      <w:lvlJc w:val="left"/>
+      <w:pPr>
+        <w:tabs>
+          <w:tab w:val="num" w:pos="6480"/>
+        </w:tabs>
+        <w:ind w:left="6480" w:hanging="360"/>
+      </w:pPr>
+      <w:rPr>
+        <w:rFonts w:ascii="Wingdings" w:hAnsi="Wingdings" w:hint="default"/>
+        <w:sz w:val="20"/>
+      </w:rPr>
+    </w:lvl>
+  </w:abstractNum>
+  <w:num w:numId="1" w16cid:durableId="1916283224">
+    <w:abstractNumId w:val="0"/>
+  </w:num>
+</w:numbering>
 </file>
 
 <file path=word/styles.xml><?xml version="1.0" encoding="utf-8"?>
@@ -1597,6 +3630,134 @@
       <w:spacing w:val="5"/>
     </w:rPr>
   </w:style>
+  <w:style w:type="table" w:styleId="Tabladelista3-nfasis6">
+    <w:name w:val="List Table 3 Accent 6"/>
+    <w:basedOn w:val="Tablanormal"/>
+    <w:uiPriority w:val="48"/>
+    <w:rsid w:val="00044F04"/>
+    <w:pPr>
+      <w:spacing w:after="0" w:line="240" w:lineRule="auto"/>
+    </w:pPr>
+    <w:rPr>
+      <w:sz w:val="24"/>
+      <w:szCs w:val="24"/>
+    </w:rPr>
+    <w:tblPr>
+      <w:tblStyleRowBandSize w:val="1"/>
+      <w:tblStyleColBandSize w:val="1"/>
+      <w:tblBorders>
+        <w:top w:val="single" w:sz="4" w:space="0" w:color="70AD47" w:themeColor="accent6"/>
+        <w:left w:val="single" w:sz="4" w:space="0" w:color="70AD47" w:themeColor="accent6"/>
+        <w:bottom w:val="single" w:sz="4" w:space="0" w:color="70AD47" w:themeColor="accent6"/>
+        <w:right w:val="single" w:sz="4" w:space="0" w:color="70AD47" w:themeColor="accent6"/>
+      </w:tblBorders>
+    </w:tblPr>
+    <w:tblStylePr w:type="firstRow">
+      <w:rPr>
+        <w:b/>
+        <w:bCs/>
+        <w:color w:val="FFFFFF" w:themeColor="background1"/>
+      </w:rPr>
+      <w:tblPr/>
+      <w:tcPr>
+        <w:shd w:val="clear" w:color="auto" w:fill="70AD47" w:themeFill="accent6"/>
+      </w:tcPr>
+    </w:tblStylePr>
+    <w:tblStylePr w:type="lastRow">
+      <w:rPr>
+        <w:b/>
+        <w:bCs/>
+      </w:rPr>
+      <w:tblPr/>
+      <w:tcPr>
+        <w:tcBorders>
+          <w:top w:val="double" w:sz="4" w:space="0" w:color="70AD47" w:themeColor="accent6"/>
+        </w:tcBorders>
+        <w:shd w:val="clear" w:color="auto" w:fill="FFFFFF" w:themeFill="background1"/>
+      </w:tcPr>
+    </w:tblStylePr>
+    <w:tblStylePr w:type="firstCol">
+      <w:rPr>
+        <w:b/>
+        <w:bCs/>
+      </w:rPr>
+      <w:tblPr/>
+      <w:tcPr>
+        <w:tcBorders>
+          <w:right w:val="nil"/>
+        </w:tcBorders>
+        <w:shd w:val="clear" w:color="auto" w:fill="FFFFFF" w:themeFill="background1"/>
+      </w:tcPr>
+    </w:tblStylePr>
+    <w:tblStylePr w:type="lastCol">
+      <w:rPr>
+        <w:b/>
+        <w:bCs/>
+      </w:rPr>
+      <w:tblPr/>
+      <w:tcPr>
+        <w:tcBorders>
+          <w:left w:val="nil"/>
+        </w:tcBorders>
+        <w:shd w:val="clear" w:color="auto" w:fill="FFFFFF" w:themeFill="background1"/>
+      </w:tcPr>
+    </w:tblStylePr>
+    <w:tblStylePr w:type="band1Vert">
+      <w:tblPr/>
+      <w:tcPr>
+        <w:tcBorders>
+          <w:left w:val="single" w:sz="4" w:space="0" w:color="70AD47" w:themeColor="accent6"/>
+          <w:right w:val="single" w:sz="4" w:space="0" w:color="70AD47" w:themeColor="accent6"/>
+        </w:tcBorders>
+      </w:tcPr>
+    </w:tblStylePr>
+    <w:tblStylePr w:type="band1Horz">
+      <w:tblPr/>
+      <w:tcPr>
+        <w:tcBorders>
+          <w:top w:val="single" w:sz="4" w:space="0" w:color="70AD47" w:themeColor="accent6"/>
+          <w:bottom w:val="single" w:sz="4" w:space="0" w:color="70AD47" w:themeColor="accent6"/>
+          <w:insideH w:val="nil"/>
+        </w:tcBorders>
+      </w:tcPr>
+    </w:tblStylePr>
+    <w:tblStylePr w:type="neCell">
+      <w:tblPr/>
+      <w:tcPr>
+        <w:tcBorders>
+          <w:left w:val="nil"/>
+          <w:bottom w:val="nil"/>
+        </w:tcBorders>
+      </w:tcPr>
+    </w:tblStylePr>
+    <w:tblStylePr w:type="nwCell">
+      <w:tblPr/>
+      <w:tcPr>
+        <w:tcBorders>
+          <w:bottom w:val="nil"/>
+          <w:right w:val="nil"/>
+        </w:tcBorders>
+      </w:tcPr>
+    </w:tblStylePr>
+    <w:tblStylePr w:type="seCell">
+      <w:tblPr/>
+      <w:tcPr>
+        <w:tcBorders>
+          <w:top w:val="double" w:sz="4" w:space="0" w:color="70AD47" w:themeColor="accent6"/>
+          <w:left w:val="nil"/>
+        </w:tcBorders>
+      </w:tcPr>
+    </w:tblStylePr>
+    <w:tblStylePr w:type="swCell">
+      <w:tblPr/>
+      <w:tcPr>
+        <w:tcBorders>
+          <w:top w:val="double" w:sz="4" w:space="0" w:color="70AD47" w:themeColor="accent6"/>
+          <w:right w:val="nil"/>
+        </w:tcBorders>
+      </w:tcPr>
+    </w:tblStylePr>
+  </w:style>
 </w:styles>
 </file>
 

</xml_diff>